<commit_message>
Fix Pri Tzaddik Rosh Chodesh and Marcheshvan interlinear editions
Restore complete vocalized Hebrew phrase pairs from the reviewed Word documents, correct translation and citation errors, and preserve all footnote content and anchors. Publish matching DOCX downloads and verify exact source-to-Word-to-reader consistency.
</commit_message>
<xml_diff>
--- a/dist/library/downloads/pri-tzaddik-rosh-chodesh-manuscript-annotated.docx
+++ b/dist/library/downloads/pri-tzaddik-rosh-chodesh-manuscript-annotated.docx
@@ -147,15 +147,21 @@
           <w:b w:val="0"/>
           <w:sz w:val="19"/>
           <w:rtl w:val="1"/>
+          <w:szCs w:val="19"/>
+          <w:bCs w:val="0"/>
+          <w:lang w:val="he-IL" w:bidi="he-IL"/>
         </w:rPr>
         <w:t xml:space="preserve">קִדּוּשׁ הַחֹדֶשׁ הִיא מִצְוָה רִאשׁוֹנָה שֶׁנִּתְּנָה לְיִשְׂרָאֵל בְּמִצְרַיִם, </w:t>
       </w:r>
       <w:r>
         <w:rPr>
           <w:rFonts w:ascii="Times New Roman" w:hAnsi="Times New Roman" w:eastAsia="Times New Roman" w:cs="Times New Roman"/>
-          <w:b/>
+          <w:b w:val="1"/>
           <w:sz w:val="19"/>
           <w:rtl w:val="0"/>
+          <w:szCs w:val="19"/>
+          <w:bCs w:val="1"/>
+          <w:lang w:val="en-US"/>
         </w:rPr>
         <w:t xml:space="preserve">Sanctification of the New Moon is the first commandment given to Israel in Egypt, </w:t>
       </w:r>
@@ -183,15 +189,21 @@
           <w:b w:val="0"/>
           <w:sz w:val="19"/>
           <w:rtl w:val="1"/>
+          <w:szCs w:val="19"/>
+          <w:bCs w:val="0"/>
+          <w:lang w:val="he-IL" w:bidi="he-IL"/>
         </w:rPr>
         <w:t xml:space="preserve">וְלֹא נֶאֶמְרָה לָהֶם רַק לְמֹשֶׁה וּלְאַהֲרֹן, </w:t>
       </w:r>
       <w:r>
         <w:rPr>
           <w:rFonts w:ascii="Times New Roman" w:hAnsi="Times New Roman" w:eastAsia="Times New Roman" w:cs="Times New Roman"/>
-          <w:b/>
+          <w:b w:val="1"/>
           <w:sz w:val="19"/>
           <w:rtl w:val="0"/>
+          <w:szCs w:val="19"/>
+          <w:bCs w:val="1"/>
+          <w:lang w:val="en-US"/>
         </w:rPr>
         <w:t xml:space="preserve">and it was not spoken directly to them, but only to Moses and Aaron, </w:t>
       </w:r>
@@ -204,15 +216,21 @@
           <w:b w:val="0"/>
           <w:sz w:val="19"/>
           <w:rtl w:val="1"/>
+          <w:szCs w:val="19"/>
+          <w:bCs w:val="0"/>
+          <w:lang w:val="he-IL" w:bidi="he-IL"/>
         </w:rPr>
         <w:t xml:space="preserve">וְלֹא אָמַר שֶׁיֹּאמְרוּ זֶה לְיִשְׂרָאֵל, </w:t>
       </w:r>
       <w:r>
         <w:rPr>
           <w:rFonts w:ascii="Times New Roman" w:hAnsi="Times New Roman" w:eastAsia="Times New Roman" w:cs="Times New Roman"/>
-          <w:b/>
+          <w:b w:val="1"/>
           <w:sz w:val="19"/>
           <w:rtl w:val="0"/>
+          <w:szCs w:val="19"/>
+          <w:bCs w:val="1"/>
+          <w:lang w:val="en-US"/>
         </w:rPr>
         <w:t xml:space="preserve">and He did not state that they should say this to all Israel; </w:t>
       </w:r>
@@ -225,15 +243,21 @@
           <w:b w:val="0"/>
           <w:sz w:val="19"/>
           <w:rtl w:val="1"/>
+          <w:szCs w:val="19"/>
+          <w:bCs w:val="0"/>
+          <w:lang w:val="he-IL" w:bidi="he-IL"/>
         </w:rPr>
         <w:t xml:space="preserve">אֲבָל מִכָּל מָקוֹם "הַחֹדֶשׁ הַזֶּה לָכֶם" – </w:t>
       </w:r>
       <w:r>
         <w:rPr>
           <w:rFonts w:ascii="Times New Roman" w:hAnsi="Times New Roman" w:eastAsia="Times New Roman" w:cs="Times New Roman"/>
-          <w:b/>
+          <w:b w:val="1"/>
           <w:sz w:val="19"/>
           <w:rtl w:val="0"/>
+          <w:szCs w:val="19"/>
+          <w:bCs w:val="1"/>
+          <w:lang w:val="en-US"/>
         </w:rPr>
         <w:t xml:space="preserve">nonetheless, 'This month shall be unto you'— </w:t>
       </w:r>
@@ -246,15 +270,21 @@
           <w:b w:val="0"/>
           <w:sz w:val="19"/>
           <w:rtl w:val="1"/>
+          <w:szCs w:val="19"/>
+          <w:bCs w:val="0"/>
+          <w:lang w:val="he-IL" w:bidi="he-IL"/>
         </w:rPr>
         <w:t xml:space="preserve">רְצוֹנוֹ לוֹמַר לְכָל יִשְׂרָאֵל, </w:t>
       </w:r>
       <w:r>
         <w:rPr>
           <w:rFonts w:ascii="Times New Roman" w:hAnsi="Times New Roman" w:eastAsia="Times New Roman" w:cs="Times New Roman"/>
-          <w:b/>
+          <w:b w:val="1"/>
           <w:sz w:val="19"/>
           <w:rtl w:val="0"/>
+          <w:szCs w:val="19"/>
+          <w:bCs w:val="1"/>
+          <w:lang w:val="en-US"/>
         </w:rPr>
         <w:t xml:space="preserve">means unto the whole of Israel, </w:t>
       </w:r>
@@ -267,15 +297,21 @@
           <w:b w:val="0"/>
           <w:sz w:val="19"/>
           <w:rtl w:val="1"/>
+          <w:szCs w:val="19"/>
+          <w:bCs w:val="0"/>
+          <w:lang w:val="he-IL" w:bidi="he-IL"/>
         </w:rPr>
         <w:t xml:space="preserve">וּכְמוֹ שֶׁנֶּאֱמַר בַּמִּדְרָשׁ רַבָּה (שְׁמוֹת פָּרָשָׁה טו): </w:t>
       </w:r>
       <w:r>
         <w:rPr>
           <w:rFonts w:ascii="Times New Roman" w:hAnsi="Times New Roman" w:eastAsia="Times New Roman" w:cs="Times New Roman"/>
-          <w:b/>
+          <w:b w:val="1"/>
           <w:sz w:val="19"/>
           <w:rtl w:val="0"/>
+          <w:szCs w:val="19"/>
+          <w:bCs w:val="1"/>
+          <w:lang w:val="en-US"/>
         </w:rPr>
         <w:t xml:space="preserve">and as stated in the Midrash Rabbah (Shemot, Parashah 15): </w:t>
       </w:r>
@@ -288,15 +324,21 @@
           <w:b w:val="0"/>
           <w:sz w:val="19"/>
           <w:rtl w:val="1"/>
+          <w:szCs w:val="19"/>
+          <w:bCs w:val="0"/>
+          <w:lang w:val="he-IL" w:bidi="he-IL"/>
         </w:rPr>
         <w:t xml:space="preserve">"רֹאשׁ חֹדֶשׁ לָכֶם" וְכוּלֵי. </w:t>
       </w:r>
       <w:r>
         <w:rPr>
           <w:rFonts w:ascii="Times New Roman" w:hAnsi="Times New Roman" w:eastAsia="Times New Roman" w:cs="Times New Roman"/>
-          <w:b/>
+          <w:b w:val="1"/>
           <w:sz w:val="19"/>
           <w:rtl w:val="0"/>
+          <w:szCs w:val="19"/>
+          <w:bCs w:val="1"/>
+          <w:lang w:val="en-US"/>
         </w:rPr>
         <w:t xml:space="preserve">'The New Moon is unto you, etc.' </w:t>
       </w:r>
@@ -309,15 +351,21 @@
           <w:b w:val="0"/>
           <w:sz w:val="19"/>
           <w:rtl w:val="1"/>
+          <w:szCs w:val="19"/>
+          <w:bCs w:val="0"/>
+          <w:lang w:val="he-IL" w:bidi="he-IL"/>
         </w:rPr>
         <w:t xml:space="preserve">רַק הַקִּדּוּשׁ נִמְסַר לִגְדוֹלֵי יִשְׂרָאֵל לְבַד, </w:t>
       </w:r>
       <w:r>
         <w:rPr>
           <w:rFonts w:ascii="Times New Roman" w:hAnsi="Times New Roman" w:eastAsia="Times New Roman" w:cs="Times New Roman"/>
-          <w:b/>
+          <w:b w:val="1"/>
           <w:sz w:val="19"/>
           <w:rtl w:val="0"/>
+          <w:szCs w:val="19"/>
+          <w:bCs w:val="1"/>
+          <w:lang w:val="en-US"/>
         </w:rPr>
         <w:t xml:space="preserve">Only the formal sanctification was entrusted to the leaders of Israel alone, </w:t>
       </w:r>
@@ -345,15 +393,21 @@
           <w:b w:val="0"/>
           <w:sz w:val="19"/>
           <w:rtl w:val="1"/>
+          <w:szCs w:val="19"/>
+          <w:bCs w:val="0"/>
+          <w:lang w:val="he-IL" w:bidi="he-IL"/>
         </w:rPr>
         <w:t xml:space="preserve">וְאִם גְּדוֹל הַדּוֹר בְּחוּץ לָאָרֶץ שֶׁלֹּא הִנִּיחַ כְּמוֹתוֹ בְּאֶרֶץ יִשְׂרָאֵל </w:t>
       </w:r>
       <w:r>
         <w:rPr>
           <w:rFonts w:ascii="Times New Roman" w:hAnsi="Times New Roman" w:eastAsia="Times New Roman" w:cs="Times New Roman"/>
-          <w:b/>
+          <w:b w:val="1"/>
           <w:sz w:val="19"/>
           <w:rtl w:val="0"/>
+          <w:szCs w:val="19"/>
+          <w:bCs w:val="1"/>
+          <w:lang w:val="en-US"/>
         </w:rPr>
         <w:t xml:space="preserve">and if the preeminent authority of the generation is in the Diaspora, having left no equal in the Land of Israel, </w:t>
       </w:r>
@@ -366,15 +420,21 @@
           <w:b w:val="0"/>
           <w:sz w:val="19"/>
           <w:rtl w:val="1"/>
+          <w:szCs w:val="19"/>
+          <w:bCs w:val="0"/>
+          <w:lang w:val="he-IL" w:bidi="he-IL"/>
         </w:rPr>
         <w:t xml:space="preserve">מְקַדֵּשׁ וְקוֹבֵעַ שָׁם, </w:t>
       </w:r>
       <w:r>
         <w:rPr>
           <w:rFonts w:ascii="Times New Roman" w:hAnsi="Times New Roman" w:eastAsia="Times New Roman" w:cs="Times New Roman"/>
-          <w:b/>
+          <w:b w:val="1"/>
           <w:sz w:val="19"/>
           <w:rtl w:val="0"/>
+          <w:szCs w:val="19"/>
+          <w:bCs w:val="1"/>
+          <w:lang w:val="en-US"/>
         </w:rPr>
         <w:t xml:space="preserve">he sanctifies and fixes the month there, </w:t>
       </w:r>
@@ -387,15 +447,21 @@
           <w:b w:val="0"/>
           <w:sz w:val="19"/>
           <w:rtl w:val="1"/>
+          <w:szCs w:val="19"/>
+          <w:bCs w:val="0"/>
+          <w:lang w:val="he-IL" w:bidi="he-IL"/>
         </w:rPr>
         <w:t xml:space="preserve">כְּמוֹ שֶׁנֶּאֱמַר בְּרַבִּי עֲקִיבָא (בְּרָכוֹת סג.). </w:t>
       </w:r>
       <w:r>
         <w:rPr>
           <w:rFonts w:ascii="Times New Roman" w:hAnsi="Times New Roman" w:eastAsia="Times New Roman" w:cs="Times New Roman"/>
-          <w:b/>
+          <w:b w:val="1"/>
           <w:sz w:val="19"/>
           <w:rtl w:val="0"/>
+          <w:szCs w:val="19"/>
+          <w:bCs w:val="1"/>
+          <w:lang w:val="en-US"/>
         </w:rPr>
         <w:t xml:space="preserve">as is related regarding Rabbi Akiva (Berakhot 63a). </w:t>
       </w:r>
@@ -423,15 +489,21 @@
           <w:b w:val="0"/>
           <w:sz w:val="19"/>
           <w:rtl w:val="1"/>
+          <w:szCs w:val="19"/>
+          <w:bCs w:val="0"/>
+          <w:lang w:val="he-IL" w:bidi="he-IL"/>
         </w:rPr>
         <w:t xml:space="preserve">וְעַכְשָׁיו קוֹבְעִין עַל פִּי הַקִּדּוּשׁ שֶׁל הִלֵּל הָאַחֲרוֹן, כַּיָּדוּעַ. </w:t>
       </w:r>
       <w:r>
         <w:rPr>
           <w:rFonts w:ascii="Times New Roman" w:hAnsi="Times New Roman" w:eastAsia="Times New Roman" w:cs="Times New Roman"/>
-          <w:b/>
+          <w:b w:val="1"/>
           <w:sz w:val="19"/>
           <w:rtl w:val="0"/>
+          <w:szCs w:val="19"/>
+          <w:bCs w:val="1"/>
+          <w:lang w:val="en-US"/>
         </w:rPr>
         <w:t xml:space="preserve">And nowadays we establish it based upon the sanctified calendar of Hillel the Latter, as is known. </w:t>
       </w:r>
@@ -449,15 +521,21 @@
           <w:b w:val="0"/>
           <w:sz w:val="19"/>
           <w:rtl w:val="1"/>
+          <w:szCs w:val="19"/>
+          <w:bCs w:val="0"/>
+          <w:lang w:val="he-IL" w:bidi="he-IL"/>
         </w:rPr>
         <w:t xml:space="preserve">וְהַיְינוּ כְּמוֹ שֶׁנֶּאֱמַר בַּמִּדְרָשׁ שָׁם: </w:t>
       </w:r>
       <w:r>
         <w:rPr>
           <w:rFonts w:ascii="Times New Roman" w:hAnsi="Times New Roman" w:eastAsia="Times New Roman" w:cs="Times New Roman"/>
-          <w:b/>
+          <w:b w:val="1"/>
           <w:sz w:val="19"/>
           <w:rtl w:val="0"/>
+          <w:szCs w:val="19"/>
+          <w:bCs w:val="1"/>
+          <w:lang w:val="en-US"/>
         </w:rPr>
         <w:t xml:space="preserve">And this is just as is stated in the Midrash there: </w:t>
       </w:r>
@@ -470,15 +548,21 @@
           <w:b w:val="0"/>
           <w:sz w:val="19"/>
           <w:rtl w:val="1"/>
+          <w:szCs w:val="19"/>
+          <w:bCs w:val="0"/>
+          <w:lang w:val="he-IL" w:bidi="he-IL"/>
         </w:rPr>
         <w:t xml:space="preserve">כִּי הַשֵּׁם יִתְבָּרַךְ לֹא רָצָה לְקַדֵּשׁ </w:t>
       </w:r>
       <w:r>
         <w:rPr>
           <w:rFonts w:ascii="Times New Roman" w:hAnsi="Times New Roman" w:eastAsia="Times New Roman" w:cs="Times New Roman"/>
-          <w:b/>
+          <w:b w:val="1"/>
           <w:sz w:val="19"/>
           <w:rtl w:val="0"/>
+          <w:szCs w:val="19"/>
+          <w:bCs w:val="1"/>
+          <w:lang w:val="en-US"/>
         </w:rPr>
         <w:t xml:space="preserve">that Hashem did not desire to sanctify it Himself, </w:t>
       </w:r>
@@ -491,15 +575,21 @@
           <w:b w:val="0"/>
           <w:sz w:val="19"/>
           <w:rtl w:val="1"/>
+          <w:szCs w:val="19"/>
+          <w:bCs w:val="0"/>
+          <w:lang w:val="he-IL" w:bidi="he-IL"/>
         </w:rPr>
         <w:t xml:space="preserve">– דִּמְקַדֵּשׁ לְעַצְמוֹ – </w:t>
       </w:r>
       <w:r>
         <w:rPr>
           <w:rFonts w:ascii="Times New Roman" w:hAnsi="Times New Roman" w:eastAsia="Times New Roman" w:cs="Times New Roman"/>
-          <w:b/>
+          <w:b w:val="1"/>
           <w:sz w:val="19"/>
           <w:rtl w:val="0"/>
+          <w:szCs w:val="19"/>
+          <w:bCs w:val="1"/>
+          <w:lang w:val="en-US"/>
         </w:rPr>
         <w:t xml:space="preserve">—for that would be sanctifying for Himself— </w:t>
       </w:r>
@@ -512,15 +602,21 @@
           <w:b w:val="0"/>
           <w:sz w:val="19"/>
           <w:rtl w:val="1"/>
+          <w:szCs w:val="19"/>
+          <w:bCs w:val="0"/>
+          <w:lang w:val="he-IL" w:bidi="he-IL"/>
         </w:rPr>
         <w:t xml:space="preserve">רַק הוּא מְקַדֵּשׁ לְיִשְׂרָאֵל, </w:t>
       </w:r>
       <w:r>
         <w:rPr>
           <w:rFonts w:ascii="Times New Roman" w:hAnsi="Times New Roman" w:eastAsia="Times New Roman" w:cs="Times New Roman"/>
-          <w:b/>
+          <w:b w:val="1"/>
           <w:sz w:val="19"/>
           <w:rtl w:val="0"/>
+          <w:szCs w:val="19"/>
+          <w:bCs w:val="1"/>
+          <w:lang w:val="en-US"/>
         </w:rPr>
         <w:t xml:space="preserve">rather, He sanctifies Israel, </w:t>
       </w:r>
@@ -533,15 +629,21 @@
           <w:b w:val="0"/>
           <w:sz w:val="19"/>
           <w:rtl w:val="1"/>
+          <w:szCs w:val="19"/>
+          <w:bCs w:val="0"/>
+          <w:lang w:val="he-IL" w:bidi="he-IL"/>
         </w:rPr>
         <w:t xml:space="preserve">וְעַל יְדֵי שֶׁהֵם קְדוֹשִׁים </w:t>
       </w:r>
       <w:r>
         <w:rPr>
           <w:rFonts w:ascii="Times New Roman" w:hAnsi="Times New Roman" w:eastAsia="Times New Roman" w:cs="Times New Roman"/>
-          <w:b/>
+          <w:b w:val="1"/>
           <w:sz w:val="19"/>
           <w:rtl w:val="0"/>
+          <w:szCs w:val="19"/>
+          <w:bCs w:val="1"/>
+          <w:lang w:val="en-US"/>
         </w:rPr>
         <w:t xml:space="preserve">and by virtue of their being holy, </w:t>
       </w:r>
@@ -569,15 +671,21 @@
           <w:b w:val="0"/>
           <w:sz w:val="19"/>
           <w:rtl w:val="1"/>
+          <w:szCs w:val="19"/>
+          <w:bCs w:val="0"/>
+          <w:lang w:val="he-IL" w:bidi="he-IL"/>
         </w:rPr>
         <w:t xml:space="preserve">מַה שֶּׁהֵם מְקַדְּשִׁין הוּא מְקוּדָּשׁ, </w:t>
       </w:r>
       <w:r>
         <w:rPr>
           <w:rFonts w:ascii="Times New Roman" w:hAnsi="Times New Roman" w:eastAsia="Times New Roman" w:cs="Times New Roman"/>
-          <w:b/>
+          <w:b w:val="1"/>
           <w:sz w:val="19"/>
           <w:rtl w:val="0"/>
+          <w:szCs w:val="19"/>
+          <w:bCs w:val="1"/>
+          <w:lang w:val="en-US"/>
         </w:rPr>
         <w:t xml:space="preserve">whatever they sanctify becomes consecrated, </w:t>
       </w:r>
@@ -590,15 +698,21 @@
           <w:b w:val="0"/>
           <w:sz w:val="19"/>
           <w:rtl w:val="1"/>
+          <w:szCs w:val="19"/>
+          <w:bCs w:val="0"/>
+          <w:lang w:val="he-IL" w:bidi="he-IL"/>
         </w:rPr>
         <w:t xml:space="preserve">כְּמוֹ כְּלִי חוֹל שֶׁמַּכְנִיס לְתוֹכוֹ קֹדֶשׁ. </w:t>
       </w:r>
       <w:r>
         <w:rPr>
           <w:rFonts w:ascii="Times New Roman" w:hAnsi="Times New Roman" w:eastAsia="Times New Roman" w:cs="Times New Roman"/>
-          <w:b/>
+          <w:b w:val="1"/>
           <w:sz w:val="19"/>
           <w:rtl w:val="0"/>
+          <w:szCs w:val="19"/>
+          <w:bCs w:val="1"/>
+          <w:lang w:val="en-US"/>
         </w:rPr>
         <w:t xml:space="preserve">like a non-sacred vessel into which one places holy matter. </w:t>
       </w:r>
@@ -611,15 +725,21 @@
           <w:b w:val="0"/>
           <w:sz w:val="19"/>
           <w:rtl w:val="1"/>
+          <w:szCs w:val="19"/>
+          <w:bCs w:val="0"/>
+          <w:lang w:val="he-IL" w:bidi="he-IL"/>
         </w:rPr>
         <w:t xml:space="preserve">וְעַל כֵּן הֵם מְקַדְּשִׁים אוֹתוֹ, </w:t>
       </w:r>
       <w:r>
         <w:rPr>
           <w:rFonts w:ascii="Times New Roman" w:hAnsi="Times New Roman" w:eastAsia="Times New Roman" w:cs="Times New Roman"/>
-          <w:b/>
+          <w:b w:val="1"/>
           <w:sz w:val="19"/>
           <w:rtl w:val="0"/>
+          <w:szCs w:val="19"/>
+          <w:bCs w:val="1"/>
+          <w:lang w:val="en-US"/>
         </w:rPr>
         <w:t xml:space="preserve">Therefore they consecrate it, </w:t>
       </w:r>
@@ -632,15 +752,21 @@
           <w:b w:val="0"/>
           <w:sz w:val="19"/>
           <w:rtl w:val="1"/>
+          <w:szCs w:val="19"/>
+          <w:bCs w:val="0"/>
+          <w:lang w:val="he-IL" w:bidi="he-IL"/>
         </w:rPr>
         <w:t xml:space="preserve">כְּמוֹ שֶׁנֶּאֱמַר: "וִהְיִיתֶם לִי קְדֹשִׁים כִּי קָדוֹשׁ אָנִי", </w:t>
       </w:r>
       <w:r>
         <w:rPr>
           <w:rFonts w:ascii="Times New Roman" w:hAnsi="Times New Roman" w:eastAsia="Times New Roman" w:cs="Times New Roman"/>
-          <w:b/>
+          <w:b w:val="1"/>
           <w:sz w:val="19"/>
           <w:rtl w:val="0"/>
+          <w:szCs w:val="19"/>
+          <w:bCs w:val="1"/>
+          <w:lang w:val="en-US"/>
         </w:rPr>
         <w:t xml:space="preserve">as is stated: 'And you shall be holy unto Me, for I am holy,' </w:t>
       </w:r>
@@ -668,17 +794,23 @@
           <w:b w:val="0"/>
           <w:sz w:val="19"/>
           <w:rtl w:val="1"/>
+          <w:szCs w:val="19"/>
+          <w:bCs w:val="0"/>
+          <w:lang w:val="he-IL" w:bidi="he-IL"/>
         </w:rPr>
         <w:t xml:space="preserve">עַיֵּין שָׁם בְּמַתְּנוֹת כְּהֻנָּה דָּחוּק. </w:t>
       </w:r>
       <w:r>
         <w:rPr>
           <w:rFonts w:ascii="Times New Roman" w:hAnsi="Times New Roman" w:eastAsia="Times New Roman" w:cs="Times New Roman"/>
-          <w:b/>
+          <w:b w:val="1"/>
           <w:sz w:val="19"/>
           <w:rtl w:val="0"/>
-        </w:rPr>
-        <w:t xml:space="preserve">see there in the commentary Matnot Kehunah, who is pressed. </w:t>
+          <w:szCs w:val="19"/>
+          <w:bCs w:val="1"/>
+          <w:lang w:val="en-US"/>
+        </w:rPr>
+        <w:t xml:space="preserve">See the Matnot Kehunah there; its explanation is strained. </w:t>
       </w:r>
       <w:r>
         <w:t xml:space="preserve">  </w:t>
@@ -689,15 +821,21 @@
           <w:b w:val="0"/>
           <w:sz w:val="19"/>
           <w:rtl w:val="1"/>
+          <w:szCs w:val="19"/>
+          <w:bCs w:val="0"/>
+          <w:lang w:val="he-IL" w:bidi="he-IL"/>
         </w:rPr>
         <w:t xml:space="preserve">וְנִרְאֶה דִּרְצוֹנוֹ לוֹמַר </w:t>
       </w:r>
       <w:r>
         <w:rPr>
           <w:rFonts w:ascii="Times New Roman" w:hAnsi="Times New Roman" w:eastAsia="Times New Roman" w:cs="Times New Roman"/>
-          <w:b/>
+          <w:b w:val="1"/>
           <w:sz w:val="19"/>
           <w:rtl w:val="0"/>
+          <w:szCs w:val="19"/>
+          <w:bCs w:val="1"/>
+          <w:lang w:val="en-US"/>
         </w:rPr>
         <w:t xml:space="preserve">And it appears that the meaning is: </w:t>
       </w:r>
@@ -710,15 +848,21 @@
           <w:b w:val="0"/>
           <w:sz w:val="19"/>
           <w:rtl w:val="1"/>
+          <w:szCs w:val="19"/>
+          <w:bCs w:val="0"/>
+          <w:lang w:val="he-IL" w:bidi="he-IL"/>
         </w:rPr>
         <w:t xml:space="preserve">דְּעַל יְדֵי שֶׁאַתֶּם קְדוֹשִׁים, </w:t>
       </w:r>
       <w:r>
         <w:rPr>
           <w:rFonts w:ascii="Times New Roman" w:hAnsi="Times New Roman" w:eastAsia="Times New Roman" w:cs="Times New Roman"/>
-          <w:b/>
+          <w:b w:val="1"/>
           <w:sz w:val="19"/>
           <w:rtl w:val="0"/>
+          <w:szCs w:val="19"/>
+          <w:bCs w:val="1"/>
+          <w:lang w:val="en-US"/>
         </w:rPr>
         <w:t xml:space="preserve">that through your being holy, </w:t>
       </w:r>
@@ -736,15 +880,21 @@
           <w:b w:val="0"/>
           <w:sz w:val="19"/>
           <w:rtl w:val="1"/>
+          <w:szCs w:val="19"/>
+          <w:bCs w:val="0"/>
+          <w:lang w:val="he-IL" w:bidi="he-IL"/>
         </w:rPr>
         <w:t xml:space="preserve">עַל יְדֵי זֶה "אֲנִי קָדוֹשׁ", </w:t>
       </w:r>
       <w:r>
         <w:rPr>
           <w:rFonts w:ascii="Times New Roman" w:hAnsi="Times New Roman" w:eastAsia="Times New Roman" w:cs="Times New Roman"/>
-          <w:b/>
+          <w:b w:val="1"/>
           <w:sz w:val="19"/>
           <w:rtl w:val="0"/>
+          <w:szCs w:val="19"/>
+          <w:bCs w:val="1"/>
+          <w:lang w:val="en-US"/>
         </w:rPr>
         <w:t xml:space="preserve">thereby 'I am holy'; </w:t>
       </w:r>
@@ -757,15 +907,21 @@
           <w:b w:val="0"/>
           <w:sz w:val="19"/>
           <w:rtl w:val="1"/>
+          <w:szCs w:val="19"/>
+          <w:bCs w:val="0"/>
+          <w:lang w:val="he-IL" w:bidi="he-IL"/>
         </w:rPr>
         <w:t xml:space="preserve">וְעַל דֶּרֶךְ זֶה כָּתְבוּ לְפָרֵשׁ מַה שֶׁכָּתוּב: </w:t>
       </w:r>
       <w:r>
         <w:rPr>
           <w:rFonts w:ascii="Times New Roman" w:hAnsi="Times New Roman" w:eastAsia="Times New Roman" w:cs="Times New Roman"/>
-          <w:b/>
+          <w:b w:val="1"/>
           <w:sz w:val="19"/>
           <w:rtl w:val="0"/>
+          <w:szCs w:val="19"/>
+          <w:bCs w:val="1"/>
+          <w:lang w:val="en-US"/>
         </w:rPr>
         <w:t xml:space="preserve">and in this manner commentators explained that which is taught: </w:t>
       </w:r>
@@ -778,15 +934,21 @@
           <w:b w:val="0"/>
           <w:sz w:val="19"/>
           <w:rtl w:val="1"/>
+          <w:szCs w:val="19"/>
+          <w:bCs w:val="0"/>
+          <w:lang w:val="he-IL" w:bidi="he-IL"/>
         </w:rPr>
         <w:t xml:space="preserve">"קְדוּשָׁתִי לְמַעְלָה מִקְּדוּשַׁתְכֶם" – </w:t>
       </w:r>
       <w:r>
         <w:rPr>
           <w:rFonts w:ascii="Times New Roman" w:hAnsi="Times New Roman" w:eastAsia="Times New Roman" w:cs="Times New Roman"/>
-          <w:b/>
+          <w:b w:val="1"/>
           <w:sz w:val="19"/>
           <w:rtl w:val="0"/>
+          <w:szCs w:val="19"/>
+          <w:bCs w:val="1"/>
+          <w:lang w:val="en-US"/>
         </w:rPr>
         <w:t xml:space="preserve">'My holiness is above your holiness'— </w:t>
       </w:r>
@@ -799,17 +961,23 @@
           <w:b w:val="0"/>
           <w:sz w:val="19"/>
           <w:rtl w:val="1"/>
+          <w:szCs w:val="19"/>
+          <w:bCs w:val="0"/>
+          <w:lang w:val="he-IL" w:bidi="he-IL"/>
         </w:rPr>
         <w:t xml:space="preserve">שֶׁעַל יְדֵי קְדוּשַׁתְכֶם אֲנִי קָדוֹשׁ מִלְּמַעְלָה. </w:t>
       </w:r>
       <w:r>
         <w:rPr>
           <w:rFonts w:ascii="Times New Roman" w:hAnsi="Times New Roman" w:eastAsia="Times New Roman" w:cs="Times New Roman"/>
-          <w:b/>
+          <w:b w:val="1"/>
           <w:sz w:val="19"/>
           <w:rtl w:val="0"/>
-        </w:rPr>
-        <w:t xml:space="preserve">that through your holiness I become sanctified from above. </w:t>
+          <w:szCs w:val="19"/>
+          <w:bCs w:val="1"/>
+          <w:lang w:val="en-US"/>
+        </w:rPr>
+        <w:t xml:space="preserve">that through your holiness I am holy Above. </w:t>
       </w:r>
       <w:r>
         <w:t xml:space="preserve">  </w:t>
@@ -820,15 +988,21 @@
           <w:b w:val="0"/>
           <w:sz w:val="19"/>
           <w:rtl w:val="1"/>
+          <w:szCs w:val="19"/>
+          <w:bCs w:val="0"/>
+          <w:lang w:val="he-IL" w:bidi="he-IL"/>
         </w:rPr>
         <w:t xml:space="preserve">וְנֶאֱמַר: "וְאַתָּה קָדוֹשׁ יוֹשֵׁב תְּהִלּוֹת יִשְׂרָאֵל", </w:t>
       </w:r>
       <w:r>
         <w:rPr>
           <w:rFonts w:ascii="Times New Roman" w:hAnsi="Times New Roman" w:eastAsia="Times New Roman" w:cs="Times New Roman"/>
-          <w:b/>
+          <w:b w:val="1"/>
           <w:sz w:val="19"/>
           <w:rtl w:val="0"/>
+          <w:szCs w:val="19"/>
+          <w:bCs w:val="1"/>
+          <w:lang w:val="en-US"/>
         </w:rPr>
         <w:t xml:space="preserve">And it is said: 'Yet You are holy, enthroned upon the praises of Israel,' </w:t>
       </w:r>
@@ -856,15 +1030,21 @@
           <w:b w:val="0"/>
           <w:sz w:val="19"/>
           <w:rtl w:val="1"/>
+          <w:szCs w:val="19"/>
+          <w:bCs w:val="0"/>
+          <w:lang w:val="he-IL" w:bidi="he-IL"/>
         </w:rPr>
         <w:t xml:space="preserve">רְצוֹנוֹ לוֹמַר עַל יְדֵי תְּהִלּוֹת יִשְׂרָאֵל, עַיֵּין שָׁם. </w:t>
       </w:r>
       <w:r>
         <w:rPr>
           <w:rFonts w:ascii="Times New Roman" w:hAnsi="Times New Roman" w:eastAsia="Times New Roman" w:cs="Times New Roman"/>
-          <w:b/>
+          <w:b w:val="1"/>
           <w:sz w:val="19"/>
           <w:rtl w:val="0"/>
+          <w:szCs w:val="19"/>
+          <w:bCs w:val="1"/>
+          <w:lang w:val="en-US"/>
         </w:rPr>
         <w:t xml:space="preserve">meaning, established through the praises of Israel, see there. </w:t>
       </w:r>
@@ -906,15 +1086,21 @@
           <w:b w:val="0"/>
           <w:sz w:val="19"/>
           <w:rtl w:val="1"/>
+          <w:szCs w:val="19"/>
+          <w:bCs w:val="0"/>
+          <w:lang w:val="he-IL" w:bidi="he-IL"/>
         </w:rPr>
         <w:t xml:space="preserve">הַכַּוָּנָה כַּיָּדוּעַ, </w:t>
       </w:r>
       <w:r>
         <w:rPr>
           <w:rFonts w:ascii="Times New Roman" w:hAnsi="Times New Roman" w:eastAsia="Times New Roman" w:cs="Times New Roman"/>
-          <w:b/>
+          <w:b w:val="1"/>
           <w:sz w:val="19"/>
           <w:rtl w:val="0"/>
+          <w:szCs w:val="19"/>
+          <w:bCs w:val="1"/>
+          <w:lang w:val="en-US"/>
         </w:rPr>
         <w:t xml:space="preserve">The inner meaning is well known, </w:t>
       </w:r>
@@ -927,15 +1113,21 @@
           <w:b w:val="0"/>
           <w:sz w:val="19"/>
           <w:rtl w:val="1"/>
+          <w:szCs w:val="19"/>
+          <w:bCs w:val="0"/>
+          <w:lang w:val="he-IL" w:bidi="he-IL"/>
         </w:rPr>
         <w:t xml:space="preserve">דְּחַמָּה וּלְבָנָה רוֹמֵז לְהַקָּדוֹשׁ בָּרוּךְ הוּא וּשְׁכִינָתוֹ, </w:t>
       </w:r>
       <w:r>
         <w:rPr>
           <w:rFonts w:ascii="Times New Roman" w:hAnsi="Times New Roman" w:eastAsia="Times New Roman" w:cs="Times New Roman"/>
-          <w:b/>
+          <w:b w:val="1"/>
           <w:sz w:val="19"/>
           <w:rtl w:val="0"/>
+          <w:szCs w:val="19"/>
+          <w:bCs w:val="1"/>
+          <w:lang w:val="en-US"/>
         </w:rPr>
         <w:t xml:space="preserve">that the sun and the moon allude to the Holy One and His Shekhinah, </w:t>
       </w:r>
@@ -948,15 +1140,21 @@
           <w:b w:val="0"/>
           <w:sz w:val="19"/>
           <w:rtl w:val="1"/>
+          <w:szCs w:val="19"/>
+          <w:bCs w:val="0"/>
+          <w:lang w:val="he-IL" w:bidi="he-IL"/>
         </w:rPr>
         <w:t xml:space="preserve">וּכְמוֹ שֶׁנֶּאֱמַר (בְּסוֹטָה י.): </w:t>
       </w:r>
       <w:r>
         <w:rPr>
           <w:rFonts w:ascii="Times New Roman" w:hAnsi="Times New Roman" w:eastAsia="Times New Roman" w:cs="Times New Roman"/>
-          <w:b/>
+          <w:b w:val="1"/>
           <w:sz w:val="19"/>
           <w:rtl w:val="0"/>
+          <w:szCs w:val="19"/>
+          <w:bCs w:val="1"/>
+          <w:lang w:val="en-US"/>
         </w:rPr>
         <w:t xml:space="preserve">and as stated (in Sotah 10a): </w:t>
       </w:r>
@@ -984,15 +1182,21 @@
           <w:b w:val="0"/>
           <w:sz w:val="19"/>
           <w:rtl w:val="1"/>
+          <w:szCs w:val="19"/>
+          <w:bCs w:val="0"/>
+          <w:lang w:val="he-IL" w:bidi="he-IL"/>
         </w:rPr>
         <w:t xml:space="preserve">"שִׁמְשׁוֹן" – עַל שֵׁם הַקָּדוֹשׁ בָּרוּךְ הוּא, </w:t>
       </w:r>
       <w:r>
         <w:rPr>
           <w:rFonts w:ascii="Times New Roman" w:hAnsi="Times New Roman" w:eastAsia="Times New Roman" w:cs="Times New Roman"/>
-          <w:b/>
+          <w:b w:val="1"/>
           <w:sz w:val="19"/>
           <w:rtl w:val="0"/>
+          <w:szCs w:val="19"/>
+          <w:bCs w:val="1"/>
+          <w:lang w:val="en-US"/>
         </w:rPr>
         <w:t xml:space="preserve">'Samson' (Shimshon) is named after the Holy One, </w:t>
       </w:r>
@@ -1005,15 +1209,21 @@
           <w:b w:val="0"/>
           <w:sz w:val="19"/>
           <w:rtl w:val="1"/>
-        </w:rPr>
-        <w:t xml:space="preserve">שֶׁנֶּאֱמַר: "כִּי שֶׁמֶשׁ וּמָגֵן ה'", </w:t>
-      </w:r>
-      <w:r>
-        <w:rPr>
-          <w:rFonts w:ascii="Times New Roman" w:hAnsi="Times New Roman" w:eastAsia="Times New Roman" w:cs="Times New Roman"/>
-          <w:b/>
+          <w:szCs w:val="19"/>
+          <w:bCs w:val="0"/>
+          <w:lang w:val="he-IL" w:bidi="he-IL"/>
+        </w:rPr>
+        <w:t xml:space="preserve">שֶׁנֶּאֱמַר: "כִּי שֶׁמֶשׁ וּמָגֵן הַשֵּׁם", </w:t>
+      </w:r>
+      <w:r>
+        <w:rPr>
+          <w:rFonts w:ascii="Times New Roman" w:hAnsi="Times New Roman" w:eastAsia="Times New Roman" w:cs="Times New Roman"/>
+          <w:b w:val="1"/>
           <w:sz w:val="19"/>
           <w:rtl w:val="0"/>
+          <w:szCs w:val="19"/>
+          <w:bCs w:val="1"/>
+          <w:lang w:val="en-US"/>
         </w:rPr>
         <w:t xml:space="preserve">as it is said: 'For a sun and a shield is Hashem'; </w:t>
       </w:r>
@@ -1041,15 +1251,21 @@
           <w:b w:val="0"/>
           <w:sz w:val="19"/>
           <w:rtl w:val="1"/>
-        </w:rPr>
-        <w:t xml:space="preserve">וְנֶאֱמַר: "כִּי ה' אֱלֹהֶיךָ אֵשׁ אֹכְלָה", </w:t>
-      </w:r>
-      <w:r>
-        <w:rPr>
-          <w:rFonts w:ascii="Times New Roman" w:hAnsi="Times New Roman" w:eastAsia="Times New Roman" w:cs="Times New Roman"/>
-          <w:b/>
+          <w:szCs w:val="19"/>
+          <w:bCs w:val="0"/>
+          <w:lang w:val="he-IL" w:bidi="he-IL"/>
+        </w:rPr>
+        <w:t xml:space="preserve">וְנֶאֱמַר: "כִּי הַשֵּׁם אֱלֹהֶיךָ אֵשׁ אֹכְלָה", </w:t>
+      </w:r>
+      <w:r>
+        <w:rPr>
+          <w:rFonts w:ascii="Times New Roman" w:hAnsi="Times New Roman" w:eastAsia="Times New Roman" w:cs="Times New Roman"/>
+          <w:b w:val="1"/>
           <w:sz w:val="19"/>
           <w:rtl w:val="0"/>
+          <w:szCs w:val="19"/>
+          <w:bCs w:val="1"/>
+          <w:lang w:val="en-US"/>
         </w:rPr>
         <w:t xml:space="preserve">and it is said: 'For Hashem your God is a consuming fire,' </w:t>
       </w:r>
@@ -1062,15 +1278,21 @@
           <w:b w:val="0"/>
           <w:sz w:val="19"/>
           <w:rtl w:val="1"/>
+          <w:szCs w:val="19"/>
+          <w:bCs w:val="0"/>
+          <w:lang w:val="he-IL" w:bidi="he-IL"/>
         </w:rPr>
         <w:t xml:space="preserve">וְכֵן הַחַמָּה גּוּף שֶׁל אֵשׁ, </w:t>
       </w:r>
       <w:r>
         <w:rPr>
           <w:rFonts w:ascii="Times New Roman" w:hAnsi="Times New Roman" w:eastAsia="Times New Roman" w:cs="Times New Roman"/>
-          <w:b/>
+          <w:b w:val="1"/>
           <w:sz w:val="19"/>
           <w:rtl w:val="0"/>
+          <w:szCs w:val="19"/>
+          <w:bCs w:val="1"/>
+          <w:lang w:val="en-US"/>
         </w:rPr>
         <w:t xml:space="preserve">and likewise the sun is a celestial body of fire, </w:t>
       </w:r>
@@ -1083,15 +1305,21 @@
           <w:b w:val="0"/>
           <w:sz w:val="19"/>
           <w:rtl w:val="1"/>
+          <w:szCs w:val="19"/>
+          <w:bCs w:val="0"/>
+          <w:lang w:val="he-IL" w:bidi="he-IL"/>
         </w:rPr>
         <w:t xml:space="preserve">וְזֶה שֶׁנֶּאֱמַר: "וְלִהַט אֹתָם הַיּוֹם הַבָּא", </w:t>
       </w:r>
       <w:r>
         <w:rPr>
           <w:rFonts w:ascii="Times New Roman" w:hAnsi="Times New Roman" w:eastAsia="Times New Roman" w:cs="Times New Roman"/>
-          <w:b/>
+          <w:b w:val="1"/>
           <w:sz w:val="19"/>
           <w:rtl w:val="0"/>
+          <w:szCs w:val="19"/>
+          <w:bCs w:val="1"/>
+          <w:lang w:val="en-US"/>
         </w:rPr>
         <w:t xml:space="preserve">and this is 'and the day that comes shall burn them up,' </w:t>
       </w:r>
@@ -1104,15 +1332,21 @@
           <w:b w:val="0"/>
           <w:sz w:val="19"/>
           <w:rtl w:val="1"/>
+          <w:szCs w:val="19"/>
+          <w:bCs w:val="0"/>
+          <w:lang w:val="he-IL" w:bidi="he-IL"/>
         </w:rPr>
         <w:t xml:space="preserve">וּכְמוֹ שֶׁנֶּאֱמַר (נְדָרִים ח:) </w:t>
       </w:r>
       <w:r>
         <w:rPr>
           <w:rFonts w:ascii="Times New Roman" w:hAnsi="Times New Roman" w:eastAsia="Times New Roman" w:cs="Times New Roman"/>
-          <w:b/>
+          <w:b w:val="1"/>
           <w:sz w:val="19"/>
           <w:rtl w:val="0"/>
+          <w:szCs w:val="19"/>
+          <w:bCs w:val="1"/>
+          <w:lang w:val="en-US"/>
         </w:rPr>
         <w:t xml:space="preserve">and as is stated (Nedarim 8b) </w:t>
       </w:r>
@@ -1125,15 +1359,21 @@
           <w:b w:val="0"/>
           <w:sz w:val="19"/>
           <w:rtl w:val="1"/>
+          <w:szCs w:val="19"/>
+          <w:bCs w:val="0"/>
+          <w:lang w:val="he-IL" w:bidi="he-IL"/>
         </w:rPr>
         <w:t xml:space="preserve">דְּמוֹצִיא חַמָּה מִנַּרְתִּיקָהּ וְכוּלֵי. </w:t>
       </w:r>
       <w:r>
         <w:rPr>
           <w:rFonts w:ascii="Times New Roman" w:hAnsi="Times New Roman" w:eastAsia="Times New Roman" w:cs="Times New Roman"/>
-          <w:b/>
+          <w:b w:val="1"/>
           <w:sz w:val="19"/>
           <w:rtl w:val="0"/>
+          <w:szCs w:val="19"/>
+          <w:bCs w:val="1"/>
+          <w:lang w:val="en-US"/>
         </w:rPr>
         <w:t xml:space="preserve">that He extracts the sun from its sheath, etc. </w:t>
       </w:r>
@@ -1161,15 +1401,21 @@
           <w:b w:val="0"/>
           <w:sz w:val="19"/>
           <w:rtl w:val="1"/>
+          <w:szCs w:val="19"/>
+          <w:bCs w:val="0"/>
+          <w:lang w:val="he-IL" w:bidi="he-IL"/>
         </w:rPr>
         <w:t xml:space="preserve">(וּבִשְׁמוֹת רַבָּה שָׁם) </w:t>
       </w:r>
       <w:r>
         <w:rPr>
           <w:rFonts w:ascii="Times New Roman" w:hAnsi="Times New Roman" w:eastAsia="Times New Roman" w:cs="Times New Roman"/>
-          <w:b/>
+          <w:b w:val="1"/>
           <w:sz w:val="19"/>
           <w:rtl w:val="0"/>
+          <w:szCs w:val="19"/>
+          <w:bCs w:val="1"/>
+          <w:lang w:val="en-US"/>
         </w:rPr>
         <w:t xml:space="preserve">(And in Shemot Rabbah there:) </w:t>
       </w:r>
@@ -1182,15 +1428,21 @@
           <w:b w:val="0"/>
           <w:sz w:val="19"/>
           <w:rtl w:val="1"/>
+          <w:szCs w:val="19"/>
+          <w:bCs w:val="0"/>
+          <w:lang w:val="he-IL" w:bidi="he-IL"/>
         </w:rPr>
         <w:t xml:space="preserve">דְּאוּמּוֹת הָעוֹלָם מוֹנִין לַחַמָּה שֶׁהִיא שֶׁל אֵשׁ וַעֲתִידִין לִידּוֹן בָּהּ, </w:t>
       </w:r>
       <w:r>
         <w:rPr>
           <w:rFonts w:ascii="Times New Roman" w:hAnsi="Times New Roman" w:eastAsia="Times New Roman" w:cs="Times New Roman"/>
-          <w:b/>
+          <w:b w:val="1"/>
           <w:sz w:val="19"/>
           <w:rtl w:val="0"/>
+          <w:szCs w:val="19"/>
+          <w:bCs w:val="1"/>
+          <w:lang w:val="en-US"/>
         </w:rPr>
         <w:t xml:space="preserve">the nations reckon by the sun, which is of fire, and are destined to be judged by it; </w:t>
       </w:r>
@@ -1208,15 +1460,21 @@
           <w:b w:val="0"/>
           <w:sz w:val="19"/>
           <w:rtl w:val="1"/>
+          <w:szCs w:val="19"/>
+          <w:bCs w:val="0"/>
+          <w:lang w:val="he-IL" w:bidi="he-IL"/>
         </w:rPr>
         <w:t xml:space="preserve">וְיִשְׂרָאֵל לַלְּבָנָה שֶׁהִיא שֶׁל אוֹר, </w:t>
       </w:r>
       <w:r>
         <w:rPr>
           <w:rFonts w:ascii="Times New Roman" w:hAnsi="Times New Roman" w:eastAsia="Times New Roman" w:cs="Times New Roman"/>
-          <w:b/>
+          <w:b w:val="1"/>
           <w:sz w:val="19"/>
           <w:rtl w:val="0"/>
+          <w:szCs w:val="19"/>
+          <w:bCs w:val="1"/>
+          <w:lang w:val="en-US"/>
         </w:rPr>
         <w:t xml:space="preserve">while Israel reckon by the moon, which is of light, </w:t>
       </w:r>
@@ -1229,15 +1487,21 @@
           <w:b w:val="0"/>
           <w:sz w:val="19"/>
           <w:rtl w:val="1"/>
+          <w:szCs w:val="19"/>
+          <w:bCs w:val="0"/>
+          <w:lang w:val="he-IL" w:bidi="he-IL"/>
         </w:rPr>
         <w:t xml:space="preserve">וְכֵן הֵם נוֹחֲלִין הָאוֹר, </w:t>
       </w:r>
       <w:r>
         <w:rPr>
           <w:rFonts w:ascii="Times New Roman" w:hAnsi="Times New Roman" w:eastAsia="Times New Roman" w:cs="Times New Roman"/>
-          <w:b/>
+          <w:b w:val="1"/>
           <w:sz w:val="19"/>
           <w:rtl w:val="0"/>
+          <w:szCs w:val="19"/>
+          <w:bCs w:val="1"/>
+          <w:lang w:val="en-US"/>
         </w:rPr>
         <w:t xml:space="preserve">and thus they inherit the light, </w:t>
       </w:r>
@@ -1250,15 +1514,21 @@
           <w:b w:val="0"/>
           <w:sz w:val="19"/>
           <w:rtl w:val="1"/>
+          <w:szCs w:val="19"/>
+          <w:bCs w:val="0"/>
+          <w:lang w:val="he-IL" w:bidi="he-IL"/>
         </w:rPr>
         <w:t xml:space="preserve">כְּמוֹ שֶׁנֶּאֱמַר: "אוֹר זָרֻעַ לַצַּדִּיק" וְגוֹמֵר, </w:t>
       </w:r>
       <w:r>
         <w:rPr>
           <w:rFonts w:ascii="Times New Roman" w:hAnsi="Times New Roman" w:eastAsia="Times New Roman" w:cs="Times New Roman"/>
-          <w:b/>
+          <w:b w:val="1"/>
           <w:sz w:val="19"/>
           <w:rtl w:val="0"/>
+          <w:szCs w:val="19"/>
+          <w:bCs w:val="1"/>
+          <w:lang w:val="en-US"/>
         </w:rPr>
         <w:t xml:space="preserve">as it is said: 'Light is sown for the righteous, etc.', </w:t>
       </w:r>
@@ -1286,15 +1556,21 @@
           <w:b w:val="0"/>
           <w:sz w:val="19"/>
           <w:rtl w:val="1"/>
+          <w:szCs w:val="19"/>
+          <w:bCs w:val="0"/>
+          <w:lang w:val="he-IL" w:bidi="he-IL"/>
         </w:rPr>
         <w:t xml:space="preserve">וְאוֹמֵר: "קוּמִי אוֹרִי כִּי בָא אוֹרֵךְ", עַיֵּין שָׁם. </w:t>
       </w:r>
       <w:r>
         <w:rPr>
           <w:rFonts w:ascii="Times New Roman" w:hAnsi="Times New Roman" w:eastAsia="Times New Roman" w:cs="Times New Roman"/>
-          <w:b/>
+          <w:b w:val="1"/>
           <w:sz w:val="19"/>
           <w:rtl w:val="0"/>
+          <w:szCs w:val="19"/>
+          <w:bCs w:val="1"/>
+          <w:lang w:val="en-US"/>
         </w:rPr>
         <w:t xml:space="preserve">and it says: 'Arise, shine, for your light has come,' see there. </w:t>
       </w:r>
@@ -1307,15 +1583,21 @@
           <w:b w:val="0"/>
           <w:sz w:val="19"/>
           <w:rtl w:val="1"/>
+          <w:szCs w:val="19"/>
+          <w:bCs w:val="0"/>
+          <w:lang w:val="he-IL" w:bidi="he-IL"/>
         </w:rPr>
         <w:t xml:space="preserve">וְהַיְינוּ דְּהָעוֹבְדֵי כּוֹכָבִים וּמַזָּלוֹת קָרוּ לֵיהּ "אֱלָהָא דֶּאֱלָהָא", </w:t>
       </w:r>
       <w:r>
         <w:rPr>
           <w:rFonts w:ascii="Times New Roman" w:hAnsi="Times New Roman" w:eastAsia="Times New Roman" w:cs="Times New Roman"/>
-          <w:b/>
+          <w:b w:val="1"/>
           <w:sz w:val="19"/>
           <w:rtl w:val="0"/>
+          <w:szCs w:val="19"/>
+          <w:bCs w:val="1"/>
+          <w:lang w:val="en-US"/>
         </w:rPr>
         <w:t xml:space="preserve">Namely, idolaters call Him 'the God of gods,' </w:t>
       </w:r>
@@ -1328,15 +1610,21 @@
           <w:b w:val="0"/>
           <w:sz w:val="19"/>
           <w:rtl w:val="1"/>
+          <w:szCs w:val="19"/>
+          <w:bCs w:val="0"/>
+          <w:lang w:val="he-IL" w:bidi="he-IL"/>
         </w:rPr>
         <w:t xml:space="preserve">כְּמוֹ שֶׁנֶּאֱמַר (סוֹף מְנָחוֹת קי.) </w:t>
       </w:r>
       <w:r>
         <w:rPr>
           <w:rFonts w:ascii="Times New Roman" w:hAnsi="Times New Roman" w:eastAsia="Times New Roman" w:cs="Times New Roman"/>
-          <w:b/>
+          <w:b w:val="1"/>
           <w:sz w:val="19"/>
           <w:rtl w:val="0"/>
+          <w:szCs w:val="19"/>
+          <w:bCs w:val="1"/>
+          <w:lang w:val="en-US"/>
         </w:rPr>
         <w:t xml:space="preserve">as stated (end of Menachot 110a) </w:t>
       </w:r>
@@ -1364,15 +1652,21 @@
           <w:b w:val="0"/>
           <w:sz w:val="19"/>
           <w:rtl w:val="1"/>
+          <w:szCs w:val="19"/>
+          <w:bCs w:val="0"/>
+          <w:lang w:val="he-IL" w:bidi="he-IL"/>
         </w:rPr>
         <w:t xml:space="preserve">עַל פָּסוּק "גָּדוֹל שְׁמִי בַּגּוֹיִם", </w:t>
       </w:r>
       <w:r>
         <w:rPr>
           <w:rFonts w:ascii="Times New Roman" w:hAnsi="Times New Roman" w:eastAsia="Times New Roman" w:cs="Times New Roman"/>
-          <w:b/>
+          <w:b w:val="1"/>
           <w:sz w:val="19"/>
           <w:rtl w:val="0"/>
+          <w:szCs w:val="19"/>
+          <w:bCs w:val="1"/>
+          <w:lang w:val="en-US"/>
         </w:rPr>
         <w:t xml:space="preserve">on the verse 'My Name is great among the nations,' </w:t>
       </w:r>
@@ -1385,15 +1679,21 @@
           <w:b w:val="0"/>
           <w:sz w:val="19"/>
           <w:rtl w:val="1"/>
+          <w:szCs w:val="19"/>
+          <w:bCs w:val="0"/>
+          <w:lang w:val="he-IL" w:bidi="he-IL"/>
         </w:rPr>
         <w:t xml:space="preserve">הַיְינוּ שֶׁאֵין מַשְׁגִּיחַ בַּתַּחְתּוֹנִים כְּלָל. </w:t>
       </w:r>
       <w:r>
         <w:rPr>
           <w:rFonts w:ascii="Times New Roman" w:hAnsi="Times New Roman" w:eastAsia="Times New Roman" w:cs="Times New Roman"/>
-          <w:b/>
+          <w:b w:val="1"/>
           <w:sz w:val="19"/>
           <w:rtl w:val="0"/>
+          <w:szCs w:val="19"/>
+          <w:bCs w:val="1"/>
+          <w:lang w:val="en-US"/>
         </w:rPr>
         <w:t xml:space="preserve">meaning that they presume He exercises no providence in the lower realms at all. </w:t>
       </w:r>
@@ -1406,15 +1706,21 @@
           <w:b w:val="0"/>
           <w:sz w:val="19"/>
           <w:rtl w:val="1"/>
+          <w:szCs w:val="19"/>
+          <w:bCs w:val="0"/>
+          <w:lang w:val="he-IL" w:bidi="he-IL"/>
         </w:rPr>
         <w:t xml:space="preserve">אֲבָל עִיקַּר בְּרִיאַת הָעוֹלָם </w:t>
       </w:r>
       <w:r>
         <w:rPr>
           <w:rFonts w:ascii="Times New Roman" w:hAnsi="Times New Roman" w:eastAsia="Times New Roman" w:cs="Times New Roman"/>
-          <w:b/>
+          <w:b w:val="1"/>
           <w:sz w:val="19"/>
           <w:rtl w:val="0"/>
+          <w:szCs w:val="19"/>
+          <w:bCs w:val="1"/>
+          <w:lang w:val="en-US"/>
         </w:rPr>
         <w:t xml:space="preserve">However, the prime purpose of the world's creation </w:t>
       </w:r>
@@ -1427,15 +1733,21 @@
           <w:b w:val="0"/>
           <w:sz w:val="19"/>
           <w:rtl w:val="1"/>
+          <w:szCs w:val="19"/>
+          <w:bCs w:val="0"/>
+          <w:lang w:val="he-IL" w:bidi="he-IL"/>
         </w:rPr>
         <w:t xml:space="preserve">לְגַלּוֹת כְּבוֹד מַלְכוּתוֹ בָּעוֹלָם, </w:t>
       </w:r>
       <w:r>
         <w:rPr>
           <w:rFonts w:ascii="Times New Roman" w:hAnsi="Times New Roman" w:eastAsia="Times New Roman" w:cs="Times New Roman"/>
-          <w:b/>
+          <w:b w:val="1"/>
           <w:sz w:val="19"/>
           <w:rtl w:val="0"/>
+          <w:szCs w:val="19"/>
+          <w:bCs w:val="1"/>
+          <w:lang w:val="en-US"/>
         </w:rPr>
         <w:t xml:space="preserve">is to manifest the honor of His kingship in the world, </w:t>
       </w:r>
@@ -1448,15 +1760,21 @@
           <w:b w:val="0"/>
           <w:sz w:val="19"/>
           <w:rtl w:val="1"/>
-        </w:rPr>
-        <w:t xml:space="preserve">וּכְמוֹ שֶׁנֶּאֱמַר: "כֹּל פָּעַל ה' לַמַּעֲנֵהוּ", </w:t>
-      </w:r>
-      <w:r>
-        <w:rPr>
-          <w:rFonts w:ascii="Times New Roman" w:hAnsi="Times New Roman" w:eastAsia="Times New Roman" w:cs="Times New Roman"/>
-          <w:b/>
+          <w:szCs w:val="19"/>
+          <w:bCs w:val="0"/>
+          <w:lang w:val="he-IL" w:bidi="he-IL"/>
+        </w:rPr>
+        <w:t xml:space="preserve">וּכְמוֹ שֶׁנֶּאֱמַר: "כֹּל פָּעַל הַשֵּׁם לַמַּעֲנֵהוּ", </w:t>
+      </w:r>
+      <w:r>
+        <w:rPr>
+          <w:rFonts w:ascii="Times New Roman" w:hAnsi="Times New Roman" w:eastAsia="Times New Roman" w:cs="Times New Roman"/>
+          <w:b w:val="1"/>
           <w:sz w:val="19"/>
           <w:rtl w:val="0"/>
+          <w:szCs w:val="19"/>
+          <w:bCs w:val="1"/>
+          <w:lang w:val="en-US"/>
         </w:rPr>
         <w:t xml:space="preserve">as it is said: 'Hashem made everything for His sake,' </w:t>
       </w:r>
@@ -1484,15 +1802,21 @@
           <w:b w:val="0"/>
           <w:sz w:val="19"/>
           <w:rtl w:val="1"/>
-        </w:rPr>
-        <w:t xml:space="preserve">וַאֲבוֹתֵינוּ זִכְרוֹנָם לִבְרָכָה אָמְרוּ (שׁוֹחֵר טוֹב תְּהִלִּים קמח): </w:t>
-      </w:r>
-      <w:r>
-        <w:rPr>
-          <w:rFonts w:ascii="Times New Roman" w:hAnsi="Times New Roman" w:eastAsia="Times New Roman" w:cs="Times New Roman"/>
-          <w:b/>
+          <w:szCs w:val="19"/>
+          <w:bCs w:val="0"/>
+          <w:lang w:val="he-IL" w:bidi="he-IL"/>
+        </w:rPr>
+        <w:t xml:space="preserve">וְאָמְרוּ חֲכָמֵינוּ זִכְרוֹנָם לִבְרָכָה (שׁוֹחֵר טוֹב, תְּהִלִּים קמח): </w:t>
+      </w:r>
+      <w:r>
+        <w:rPr>
+          <w:rFonts w:ascii="Times New Roman" w:hAnsi="Times New Roman" w:eastAsia="Times New Roman" w:cs="Times New Roman"/>
+          <w:b w:val="1"/>
           <w:sz w:val="19"/>
           <w:rtl w:val="0"/>
+          <w:szCs w:val="19"/>
+          <w:bCs w:val="1"/>
+          <w:lang w:val="en-US"/>
         </w:rPr>
         <w:t xml:space="preserve">and our Sages said (Shocher Tov, Tehillim 148): </w:t>
       </w:r>
@@ -1525,15 +1849,21 @@
           <w:b w:val="0"/>
           <w:sz w:val="19"/>
           <w:rtl w:val="1"/>
+          <w:szCs w:val="19"/>
+          <w:bCs w:val="0"/>
+          <w:lang w:val="he-IL" w:bidi="he-IL"/>
         </w:rPr>
         <w:t xml:space="preserve">"לְקִילּוּסוֹ", </w:t>
       </w:r>
       <w:r>
         <w:rPr>
           <w:rFonts w:ascii="Times New Roman" w:hAnsi="Times New Roman" w:eastAsia="Times New Roman" w:cs="Times New Roman"/>
-          <w:b/>
+          <w:b w:val="1"/>
           <w:sz w:val="19"/>
           <w:rtl w:val="0"/>
+          <w:szCs w:val="19"/>
+          <w:bCs w:val="1"/>
+          <w:lang w:val="en-US"/>
         </w:rPr>
         <w:t xml:space="preserve">'for His praise,' </w:t>
       </w:r>
@@ -1546,15 +1876,21 @@
           <w:b w:val="0"/>
           <w:sz w:val="19"/>
           <w:rtl w:val="1"/>
+          <w:szCs w:val="19"/>
+          <w:bCs w:val="0"/>
+          <w:lang w:val="he-IL" w:bidi="he-IL"/>
         </w:rPr>
         <w:t xml:space="preserve">וְזֶהוּ שְׁכִינָתוֹ יִתְבָּרַךְ בַּתַּחְתּוֹנִים. </w:t>
       </w:r>
       <w:r>
         <w:rPr>
           <w:rFonts w:ascii="Times New Roman" w:hAnsi="Times New Roman" w:eastAsia="Times New Roman" w:cs="Times New Roman"/>
-          <w:b/>
+          <w:b w:val="1"/>
           <w:sz w:val="19"/>
           <w:rtl w:val="0"/>
+          <w:szCs w:val="19"/>
+          <w:bCs w:val="1"/>
+          <w:lang w:val="en-US"/>
         </w:rPr>
         <w:t xml:space="preserve">and this is His holy Shekhinah residing in the lower realms. </w:t>
       </w:r>
@@ -1567,15 +1903,21 @@
           <w:b w:val="0"/>
           <w:sz w:val="19"/>
           <w:rtl w:val="1"/>
+          <w:szCs w:val="19"/>
+          <w:bCs w:val="0"/>
+          <w:lang w:val="he-IL" w:bidi="he-IL"/>
         </w:rPr>
         <w:t xml:space="preserve">וְאַבְרָהָם אָבִינוּ עָלָיו הַשָּׁלוֹם הָיָה הָרִאשׁוֹן לְפַרְסֵם זֶה בָּעוֹלָם, </w:t>
       </w:r>
       <w:r>
         <w:rPr>
           <w:rFonts w:ascii="Times New Roman" w:hAnsi="Times New Roman" w:eastAsia="Times New Roman" w:cs="Times New Roman"/>
-          <w:b/>
+          <w:b w:val="1"/>
           <w:sz w:val="19"/>
           <w:rtl w:val="0"/>
+          <w:szCs w:val="19"/>
+          <w:bCs w:val="1"/>
+          <w:lang w:val="en-US"/>
         </w:rPr>
         <w:t xml:space="preserve">And Abraham our father, peace be upon him, was the first to publicize this in the world, </w:t>
       </w:r>
@@ -1588,15 +1930,21 @@
           <w:b w:val="0"/>
           <w:sz w:val="19"/>
           <w:rtl w:val="1"/>
+          <w:szCs w:val="19"/>
+          <w:bCs w:val="0"/>
+          <w:lang w:val="he-IL" w:bidi="he-IL"/>
         </w:rPr>
         <w:t xml:space="preserve">וּכְמוֹ שֶׁכָּתְבוּ זִכְרוֹנָם לִבְרָכָה (בִּבְרֵאשִׁית רַבָּה פָּרָשַׁת חַיֵּי שָׂרָה נט, ח) </w:t>
       </w:r>
       <w:r>
         <w:rPr>
           <w:rFonts w:ascii="Times New Roman" w:hAnsi="Times New Roman" w:eastAsia="Times New Roman" w:cs="Times New Roman"/>
-          <w:b/>
+          <w:b w:val="1"/>
           <w:sz w:val="19"/>
           <w:rtl w:val="0"/>
+          <w:szCs w:val="19"/>
+          <w:bCs w:val="1"/>
+          <w:lang w:val="en-US"/>
         </w:rPr>
         <w:t xml:space="preserve">as our Sages wrote (Bereishit Rabbah, Parashat Chayei Sarah 59:8) </w:t>
       </w:r>
@@ -1624,15 +1972,21 @@
           <w:b w:val="0"/>
           <w:sz w:val="19"/>
           <w:rtl w:val="1"/>
+          <w:szCs w:val="19"/>
+          <w:bCs w:val="0"/>
+          <w:lang w:val="he-IL" w:bidi="he-IL"/>
         </w:rPr>
         <w:t xml:space="preserve">עַל פָּסוּק "אֱלֹהֵי הַשָּׁמַיִם וֵאלֹהֵי הָאָרֶץ", </w:t>
       </w:r>
       <w:r>
         <w:rPr>
           <w:rFonts w:ascii="Times New Roman" w:hAnsi="Times New Roman" w:eastAsia="Times New Roman" w:cs="Times New Roman"/>
-          <w:b/>
+          <w:b w:val="1"/>
           <w:sz w:val="19"/>
           <w:rtl w:val="0"/>
+          <w:szCs w:val="19"/>
+          <w:bCs w:val="1"/>
+          <w:lang w:val="en-US"/>
         </w:rPr>
         <w:t xml:space="preserve">on the verse 'God of the heavens and God of the earth': </w:t>
       </w:r>
@@ -1645,15 +1999,21 @@
           <w:b w:val="0"/>
           <w:sz w:val="19"/>
           <w:rtl w:val="1"/>
+          <w:szCs w:val="19"/>
+          <w:bCs w:val="0"/>
+          <w:lang w:val="he-IL" w:bidi="he-IL"/>
         </w:rPr>
         <w:t xml:space="preserve">דְּעַד עַכְשָׁיו וְכוּלֵי, </w:t>
       </w:r>
       <w:r>
         <w:rPr>
           <w:rFonts w:ascii="Times New Roman" w:hAnsi="Times New Roman" w:eastAsia="Times New Roman" w:cs="Times New Roman"/>
-          <w:b/>
+          <w:b w:val="1"/>
           <w:sz w:val="19"/>
           <w:rtl w:val="0"/>
+          <w:szCs w:val="19"/>
+          <w:bCs w:val="1"/>
+          <w:lang w:val="en-US"/>
         </w:rPr>
         <w:t xml:space="preserve">that until now He was God of heaven alone, etc., </w:t>
       </w:r>
@@ -1666,15 +2026,21 @@
           <w:b w:val="0"/>
           <w:sz w:val="19"/>
           <w:rtl w:val="1"/>
+          <w:szCs w:val="19"/>
+          <w:bCs w:val="0"/>
+          <w:lang w:val="he-IL" w:bidi="he-IL"/>
         </w:rPr>
         <w:t xml:space="preserve">וְעַכְשָׁיו "אֱלֹהֵי הָאָרֶץ" – </w:t>
       </w:r>
       <w:r>
         <w:rPr>
           <w:rFonts w:ascii="Times New Roman" w:hAnsi="Times New Roman" w:eastAsia="Times New Roman" w:cs="Times New Roman"/>
-          <w:b/>
+          <w:b w:val="1"/>
           <w:sz w:val="19"/>
           <w:rtl w:val="0"/>
+          <w:szCs w:val="19"/>
+          <w:bCs w:val="1"/>
+          <w:lang w:val="en-US"/>
         </w:rPr>
         <w:t xml:space="preserve">and now 'God of the earth'— </w:t>
       </w:r>
@@ -1687,15 +2053,21 @@
           <w:b w:val="0"/>
           <w:sz w:val="19"/>
           <w:rtl w:val="1"/>
+          <w:szCs w:val="19"/>
+          <w:bCs w:val="0"/>
+          <w:lang w:val="he-IL" w:bidi="he-IL"/>
         </w:rPr>
         <w:t xml:space="preserve">שֶׁפִּרְסֵם הַשְׁגָּחָתוֹ בַּתַּחְתּוֹנִים. </w:t>
       </w:r>
       <w:r>
         <w:rPr>
           <w:rFonts w:ascii="Times New Roman" w:hAnsi="Times New Roman" w:eastAsia="Times New Roman" w:cs="Times New Roman"/>
-          <w:b/>
+          <w:b w:val="1"/>
           <w:sz w:val="19"/>
           <w:rtl w:val="0"/>
+          <w:szCs w:val="19"/>
+          <w:bCs w:val="1"/>
+          <w:lang w:val="en-US"/>
         </w:rPr>
         <w:t xml:space="preserve">for he proclaimed His providence in the lower realms. </w:t>
       </w:r>
@@ -1708,15 +2080,21 @@
           <w:b w:val="0"/>
           <w:sz w:val="19"/>
           <w:rtl w:val="1"/>
+          <w:szCs w:val="19"/>
+          <w:bCs w:val="0"/>
+          <w:lang w:val="he-IL" w:bidi="he-IL"/>
         </w:rPr>
         <w:t xml:space="preserve">וְאָמַר עַל זֶה (בִּבְרֵאשִׁית רַבָּה סוֹף פָּרָשָׁה ל): </w:t>
       </w:r>
       <w:r>
         <w:rPr>
           <w:rFonts w:ascii="Times New Roman" w:hAnsi="Times New Roman" w:eastAsia="Times New Roman" w:cs="Times New Roman"/>
-          <w:b/>
+          <w:b w:val="1"/>
           <w:sz w:val="19"/>
           <w:rtl w:val="0"/>
+          <w:szCs w:val="19"/>
+          <w:bCs w:val="1"/>
+          <w:lang w:val="en-US"/>
         </w:rPr>
         <w:t xml:space="preserve">And it was said on this (Bereishit Rabbah, end of Parashah 30): </w:t>
       </w:r>
@@ -1744,15 +2122,21 @@
           <w:b w:val="0"/>
           <w:sz w:val="19"/>
           <w:rtl w:val="1"/>
+          <w:szCs w:val="19"/>
+          <w:bCs w:val="0"/>
+          <w:lang w:val="he-IL" w:bidi="he-IL"/>
         </w:rPr>
         <w:t xml:space="preserve">דְּאָמַר לֵיהּ הַקָּדוֹשׁ בָּרוּךְ הוּא: </w:t>
       </w:r>
       <w:r>
         <w:rPr>
           <w:rFonts w:ascii="Times New Roman" w:hAnsi="Times New Roman" w:eastAsia="Times New Roman" w:cs="Times New Roman"/>
-          <w:b/>
+          <w:b w:val="1"/>
           <w:sz w:val="19"/>
           <w:rtl w:val="0"/>
+          <w:szCs w:val="19"/>
+          <w:bCs w:val="1"/>
+          <w:lang w:val="en-US"/>
         </w:rPr>
         <w:t xml:space="preserve">that the Holy One said to him: </w:t>
       </w:r>
@@ -1765,17 +2149,23 @@
           <w:b w:val="0"/>
           <w:sz w:val="19"/>
           <w:rtl w:val="1"/>
+          <w:szCs w:val="19"/>
+          <w:bCs w:val="0"/>
+          <w:lang w:val="he-IL" w:bidi="he-IL"/>
         </w:rPr>
         <w:t xml:space="preserve">"עַד שֶׁאַתָּה מֵאִיר לִי מֵאַסְפּוֹטַמְיָא, </w:t>
       </w:r>
       <w:r>
         <w:rPr>
           <w:rFonts w:ascii="Times New Roman" w:hAnsi="Times New Roman" w:eastAsia="Times New Roman" w:cs="Times New Roman"/>
-          <w:b/>
+          <w:b w:val="1"/>
           <w:sz w:val="19"/>
           <w:rtl w:val="0"/>
-        </w:rPr>
-        <w:t xml:space="preserve">"'Rather than illuminating for Me from Mesopotamia, </w:t>
+          <w:szCs w:val="19"/>
+          <w:bCs w:val="1"/>
+          <w:lang w:val="en-US"/>
+        </w:rPr>
+        <w:t xml:space="preserve">‘While you illuminate for Me from Mesopotamia, </w:t>
       </w:r>
       <w:r>
         <w:t xml:space="preserve">  </w:t>
@@ -1786,15 +2176,21 @@
           <w:b w:val="0"/>
           <w:sz w:val="19"/>
           <w:rtl w:val="1"/>
+          <w:szCs w:val="19"/>
+          <w:bCs w:val="0"/>
+          <w:lang w:val="he-IL" w:bidi="he-IL"/>
         </w:rPr>
         <w:t xml:space="preserve">בֹּא וְהָאֵר לְפָנַי בְּאֶרֶץ יִשְׂרָאֵל וְכוּלֵי", </w:t>
       </w:r>
       <w:r>
         <w:rPr>
           <w:rFonts w:ascii="Times New Roman" w:hAnsi="Times New Roman" w:eastAsia="Times New Roman" w:cs="Times New Roman"/>
-          <w:b/>
+          <w:b w:val="1"/>
           <w:sz w:val="19"/>
           <w:rtl w:val="0"/>
+          <w:szCs w:val="19"/>
+          <w:bCs w:val="1"/>
+          <w:lang w:val="en-US"/>
         </w:rPr>
         <w:t xml:space="preserve">come and illuminate before Me in the Land of Israel, etc.' </w:t>
       </w:r>
@@ -1812,15 +2208,21 @@
           <w:b w:val="0"/>
           <w:sz w:val="19"/>
           <w:rtl w:val="1"/>
+          <w:szCs w:val="19"/>
+          <w:bCs w:val="0"/>
+          <w:lang w:val="he-IL" w:bidi="he-IL"/>
         </w:rPr>
         <w:t xml:space="preserve">דְּזֶה נִקְרָא שֶׁמֵּאִיר לְפָנָיו יִתְבָּרַךְ, </w:t>
       </w:r>
       <w:r>
         <w:rPr>
           <w:rFonts w:ascii="Times New Roman" w:hAnsi="Times New Roman" w:eastAsia="Times New Roman" w:cs="Times New Roman"/>
-          <w:b/>
+          <w:b w:val="1"/>
           <w:sz w:val="19"/>
           <w:rtl w:val="0"/>
+          <w:szCs w:val="19"/>
+          <w:bCs w:val="1"/>
+          <w:lang w:val="en-US"/>
         </w:rPr>
         <w:t xml:space="preserve">For this is defined as illuminating before Him, </w:t>
       </w:r>
@@ -1833,15 +2235,21 @@
           <w:b w:val="0"/>
           <w:sz w:val="19"/>
           <w:rtl w:val="1"/>
+          <w:szCs w:val="19"/>
+          <w:bCs w:val="0"/>
+          <w:lang w:val="he-IL" w:bidi="he-IL"/>
         </w:rPr>
         <w:t xml:space="preserve">עַל יְדֵי שֶׁמְּפַרְסֵם כְּבוֹד מַלְכוּתוֹ עַל כָּל הַבְּרִיאָה. </w:t>
       </w:r>
       <w:r>
         <w:rPr>
           <w:rFonts w:ascii="Times New Roman" w:hAnsi="Times New Roman" w:eastAsia="Times New Roman" w:cs="Times New Roman"/>
-          <w:b/>
+          <w:b w:val="1"/>
           <w:sz w:val="19"/>
           <w:rtl w:val="0"/>
+          <w:szCs w:val="19"/>
+          <w:bCs w:val="1"/>
+          <w:lang w:val="en-US"/>
         </w:rPr>
         <w:t xml:space="preserve">by spreading the glory of His sovereignty over all Creation. </w:t>
       </w:r>
@@ -1854,15 +2262,21 @@
           <w:b w:val="0"/>
           <w:sz w:val="19"/>
           <w:rtl w:val="1"/>
+          <w:szCs w:val="19"/>
+          <w:bCs w:val="0"/>
+          <w:lang w:val="he-IL" w:bidi="he-IL"/>
         </w:rPr>
         <w:t xml:space="preserve">וְזֶה דּוּגְמַת הַלְּבָנָה הַמְּקַבֶּלֶת אוֹר מֵהַחַמָּה, </w:t>
       </w:r>
       <w:r>
         <w:rPr>
           <w:rFonts w:ascii="Times New Roman" w:hAnsi="Times New Roman" w:eastAsia="Times New Roman" w:cs="Times New Roman"/>
-          <w:b/>
+          <w:b w:val="1"/>
           <w:sz w:val="19"/>
           <w:rtl w:val="0"/>
+          <w:szCs w:val="19"/>
+          <w:bCs w:val="1"/>
+          <w:lang w:val="en-US"/>
         </w:rPr>
         <w:t xml:space="preserve">And this parallels the moon, which receives its luminescence from the sun; </w:t>
       </w:r>
@@ -1875,15 +2289,21 @@
           <w:b w:val="0"/>
           <w:sz w:val="19"/>
           <w:rtl w:val="1"/>
+          <w:szCs w:val="19"/>
+          <w:bCs w:val="0"/>
+          <w:lang w:val="he-IL" w:bidi="he-IL"/>
         </w:rPr>
         <w:t xml:space="preserve">וְזֶה שֶׁנֶּאֱמַר: "קוּמִי אוֹרִי", </w:t>
       </w:r>
       <w:r>
         <w:rPr>
           <w:rFonts w:ascii="Times New Roman" w:hAnsi="Times New Roman" w:eastAsia="Times New Roman" w:cs="Times New Roman"/>
-          <w:b/>
+          <w:b w:val="1"/>
           <w:sz w:val="19"/>
           <w:rtl w:val="0"/>
+          <w:szCs w:val="19"/>
+          <w:bCs w:val="1"/>
+          <w:lang w:val="en-US"/>
         </w:rPr>
         <w:t xml:space="preserve">and this is 'Arise, shine,'— </w:t>
       </w:r>
@@ -1925,15 +2345,21 @@
           <w:b w:val="0"/>
           <w:sz w:val="19"/>
           <w:rtl w:val="1"/>
+          <w:szCs w:val="19"/>
+          <w:bCs w:val="0"/>
+          <w:lang w:val="he-IL" w:bidi="he-IL"/>
         </w:rPr>
         <w:t xml:space="preserve">שֶׁיִּשְׂרָאֵל מְאִירִין לְפָנָיו יִתְבָּרַךְ; </w:t>
       </w:r>
       <w:r>
         <w:rPr>
           <w:rFonts w:ascii="Times New Roman" w:hAnsi="Times New Roman" w:eastAsia="Times New Roman" w:cs="Times New Roman"/>
-          <w:b/>
+          <w:b w:val="1"/>
           <w:sz w:val="19"/>
           <w:rtl w:val="0"/>
+          <w:szCs w:val="19"/>
+          <w:bCs w:val="1"/>
+          <w:lang w:val="en-US"/>
         </w:rPr>
         <w:t xml:space="preserve">that Israel illuminate before Him; </w:t>
       </w:r>
@@ -1946,15 +2372,21 @@
           <w:b w:val="0"/>
           <w:sz w:val="19"/>
           <w:rtl w:val="1"/>
+          <w:szCs w:val="19"/>
+          <w:bCs w:val="0"/>
+          <w:lang w:val="he-IL" w:bidi="he-IL"/>
         </w:rPr>
         <w:t xml:space="preserve">וּמֵהֵיכָן לוֹקְחִין אוֹר? </w:t>
       </w:r>
       <w:r>
         <w:rPr>
           <w:rFonts w:ascii="Times New Roman" w:hAnsi="Times New Roman" w:eastAsia="Times New Roman" w:cs="Times New Roman"/>
-          <w:b/>
+          <w:b w:val="1"/>
           <w:sz w:val="19"/>
           <w:rtl w:val="0"/>
+          <w:szCs w:val="19"/>
+          <w:bCs w:val="1"/>
+          <w:lang w:val="en-US"/>
         </w:rPr>
         <w:t xml:space="preserve">and whence do they draw this light? </w:t>
       </w:r>
@@ -1967,15 +2399,21 @@
           <w:b w:val="0"/>
           <w:sz w:val="19"/>
           <w:rtl w:val="1"/>
+          <w:szCs w:val="19"/>
+          <w:bCs w:val="0"/>
+          <w:lang w:val="he-IL" w:bidi="he-IL"/>
         </w:rPr>
         <w:t xml:space="preserve">עַל יְדֵי הַשֵּׁם יִתְבָּרַךְ: "אוֹרֵךְ" – וּמֵאִיר לָהֶם. </w:t>
       </w:r>
       <w:r>
         <w:rPr>
           <w:rFonts w:ascii="Times New Roman" w:hAnsi="Times New Roman" w:eastAsia="Times New Roman" w:cs="Times New Roman"/>
-          <w:b/>
+          <w:b w:val="1"/>
           <w:sz w:val="19"/>
           <w:rtl w:val="0"/>
+          <w:szCs w:val="19"/>
+          <w:bCs w:val="1"/>
+          <w:lang w:val="en-US"/>
         </w:rPr>
         <w:t xml:space="preserve">Via Hashem: 'your light'—He shines upon them. </w:t>
       </w:r>
@@ -2003,15 +2441,21 @@
           <w:b w:val="0"/>
           <w:sz w:val="19"/>
           <w:rtl w:val="1"/>
+          <w:szCs w:val="19"/>
+          <w:bCs w:val="0"/>
+          <w:lang w:val="he-IL" w:bidi="he-IL"/>
         </w:rPr>
         <w:t xml:space="preserve">וְעַל דֶּרֶךְ זֶה אָמְרוּ בַּמִּדְרָשׁ רַבָּה (תְּצַוֶּה סוֹף פָּרָשָׁה לו) </w:t>
       </w:r>
       <w:r>
         <w:rPr>
           <w:rFonts w:ascii="Times New Roman" w:hAnsi="Times New Roman" w:eastAsia="Times New Roman" w:cs="Times New Roman"/>
-          <w:b/>
+          <w:b w:val="1"/>
           <w:sz w:val="19"/>
           <w:rtl w:val="0"/>
+          <w:szCs w:val="19"/>
+          <w:bCs w:val="1"/>
+          <w:lang w:val="en-US"/>
         </w:rPr>
         <w:t xml:space="preserve">And in this manner they expounded in Midrash Rabbah (Tetzaveh, end of Parashah 36) </w:t>
       </w:r>
@@ -2024,15 +2468,21 @@
           <w:b w:val="0"/>
           <w:sz w:val="19"/>
           <w:rtl w:val="1"/>
+          <w:szCs w:val="19"/>
+          <w:bCs w:val="0"/>
+          <w:lang w:val="he-IL" w:bidi="he-IL"/>
         </w:rPr>
         <w:t xml:space="preserve">בַּמְּנוֹרָה: </w:t>
       </w:r>
       <w:r>
         <w:rPr>
           <w:rFonts w:ascii="Times New Roman" w:hAnsi="Times New Roman" w:eastAsia="Times New Roman" w:cs="Times New Roman"/>
-          <w:b/>
+          <w:b w:val="1"/>
           <w:sz w:val="19"/>
           <w:rtl w:val="0"/>
+          <w:szCs w:val="19"/>
+          <w:bCs w:val="1"/>
+          <w:lang w:val="en-US"/>
         </w:rPr>
         <w:t xml:space="preserve">regarding the Menorah: </w:t>
       </w:r>
@@ -2045,15 +2495,21 @@
           <w:b w:val="0"/>
           <w:sz w:val="19"/>
           <w:rtl w:val="1"/>
+          <w:szCs w:val="19"/>
+          <w:bCs w:val="0"/>
+          <w:lang w:val="he-IL" w:bidi="he-IL"/>
         </w:rPr>
         <w:t xml:space="preserve">הַקָּדוֹשׁ בָּרוּךְ הוּא מֵאִיר לְכָל הָעוֹלָם </w:t>
       </w:r>
       <w:r>
         <w:rPr>
           <w:rFonts w:ascii="Times New Roman" w:hAnsi="Times New Roman" w:eastAsia="Times New Roman" w:cs="Times New Roman"/>
-          <w:b/>
+          <w:b w:val="1"/>
           <w:sz w:val="19"/>
           <w:rtl w:val="0"/>
+          <w:szCs w:val="19"/>
+          <w:bCs w:val="1"/>
+          <w:lang w:val="en-US"/>
         </w:rPr>
         <w:t xml:space="preserve">the Holy One illuminates the whole universe, </w:t>
       </w:r>
@@ -2066,15 +2522,21 @@
           <w:b w:val="0"/>
           <w:sz w:val="19"/>
           <w:rtl w:val="1"/>
+          <w:szCs w:val="19"/>
+          <w:bCs w:val="0"/>
+          <w:lang w:val="he-IL" w:bidi="he-IL"/>
         </w:rPr>
         <w:t xml:space="preserve">וּמְצַוֶּה לְהָאִיר לְפָנָיו. </w:t>
       </w:r>
       <w:r>
         <w:rPr>
           <w:rFonts w:ascii="Times New Roman" w:hAnsi="Times New Roman" w:eastAsia="Times New Roman" w:cs="Times New Roman"/>
-          <w:b/>
+          <w:b w:val="1"/>
           <w:sz w:val="19"/>
           <w:rtl w:val="0"/>
+          <w:szCs w:val="19"/>
+          <w:bCs w:val="1"/>
+          <w:lang w:val="en-US"/>
         </w:rPr>
         <w:t xml:space="preserve">yet commands that they illuminate before Him. </w:t>
       </w:r>
@@ -2087,15 +2549,21 @@
           <w:b w:val="0"/>
           <w:sz w:val="19"/>
           <w:rtl w:val="1"/>
+          <w:szCs w:val="19"/>
+          <w:bCs w:val="0"/>
+          <w:lang w:val="he-IL" w:bidi="he-IL"/>
         </w:rPr>
         <w:t xml:space="preserve">כִּי שֶׁמֶן הִיא חָכְמָה, </w:t>
       </w:r>
       <w:r>
         <w:rPr>
           <w:rFonts w:ascii="Times New Roman" w:hAnsi="Times New Roman" w:eastAsia="Times New Roman" w:cs="Times New Roman"/>
-          <w:b/>
+          <w:b w:val="1"/>
           <w:sz w:val="19"/>
           <w:rtl w:val="0"/>
+          <w:szCs w:val="19"/>
+          <w:bCs w:val="1"/>
+          <w:lang w:val="en-US"/>
         </w:rPr>
         <w:t xml:space="preserve">For oil represents Chokhmah (Wisdom), </w:t>
       </w:r>
@@ -2123,15 +2591,21 @@
           <w:b w:val="0"/>
           <w:sz w:val="19"/>
           <w:rtl w:val="1"/>
+          <w:szCs w:val="19"/>
+          <w:bCs w:val="0"/>
+          <w:lang w:val="he-IL" w:bidi="he-IL"/>
         </w:rPr>
         <w:t xml:space="preserve">וְאוֹר הַשֶּׁמֶן הִיא אוֹר תּוֹרָה. </w:t>
       </w:r>
       <w:r>
         <w:rPr>
           <w:rFonts w:ascii="Times New Roman" w:hAnsi="Times New Roman" w:eastAsia="Times New Roman" w:cs="Times New Roman"/>
-          <w:b/>
+          <w:b w:val="1"/>
           <w:sz w:val="19"/>
           <w:rtl w:val="0"/>
+          <w:szCs w:val="19"/>
+          <w:bCs w:val="1"/>
+          <w:lang w:val="en-US"/>
         </w:rPr>
         <w:t xml:space="preserve">and the light of the oil is the light of the Torah. </w:t>
       </w:r>
@@ -2144,15 +2618,21 @@
           <w:b w:val="0"/>
           <w:sz w:val="19"/>
           <w:rtl w:val="1"/>
+          <w:szCs w:val="19"/>
+          <w:bCs w:val="0"/>
+          <w:lang w:val="he-IL" w:bidi="he-IL"/>
         </w:rPr>
         <w:t xml:space="preserve">וְהַשֵּׁם יִתְבָּרַךְ מֵאִיר בְּאוֹר תּוֹרָה שֶׁבִּכְתָב, </w:t>
       </w:r>
       <w:r>
         <w:rPr>
           <w:rFonts w:ascii="Times New Roman" w:hAnsi="Times New Roman" w:eastAsia="Times New Roman" w:cs="Times New Roman"/>
-          <w:b/>
+          <w:b w:val="1"/>
           <w:sz w:val="19"/>
           <w:rtl w:val="0"/>
+          <w:szCs w:val="19"/>
+          <w:bCs w:val="1"/>
+          <w:lang w:val="en-US"/>
         </w:rPr>
         <w:t xml:space="preserve">And Hashem illuminates through the light of the Written Torah, </w:t>
       </w:r>
@@ -2165,15 +2645,21 @@
           <w:b w:val="0"/>
           <w:sz w:val="19"/>
           <w:rtl w:val="1"/>
+          <w:szCs w:val="19"/>
+          <w:bCs w:val="0"/>
+          <w:lang w:val="he-IL" w:bidi="he-IL"/>
         </w:rPr>
         <w:t xml:space="preserve">וְיִשְׂרָאֵל מְאִירִים בְּתוֹרָה שֶׁבְּעַל פֶּה, </w:t>
       </w:r>
       <w:r>
         <w:rPr>
           <w:rFonts w:ascii="Times New Roman" w:hAnsi="Times New Roman" w:eastAsia="Times New Roman" w:cs="Times New Roman"/>
-          <w:b/>
+          <w:b w:val="1"/>
           <w:sz w:val="19"/>
           <w:rtl w:val="0"/>
+          <w:szCs w:val="19"/>
+          <w:bCs w:val="1"/>
+          <w:lang w:val="en-US"/>
         </w:rPr>
         <w:t xml:space="preserve">and Israel illuminate through the Oral Torah, </w:t>
       </w:r>
@@ -2186,15 +2672,21 @@
           <w:b w:val="0"/>
           <w:sz w:val="19"/>
           <w:rtl w:val="1"/>
+          <w:szCs w:val="19"/>
+          <w:bCs w:val="0"/>
+          <w:lang w:val="he-IL" w:bidi="he-IL"/>
         </w:rPr>
         <w:t xml:space="preserve">שֶׁזֶּהוּ מַה שֶּׁהֵם מְחַדְּשִׁים. </w:t>
       </w:r>
       <w:r>
         <w:rPr>
           <w:rFonts w:ascii="Times New Roman" w:hAnsi="Times New Roman" w:eastAsia="Times New Roman" w:cs="Times New Roman"/>
-          <w:b/>
+          <w:b w:val="1"/>
           <w:sz w:val="19"/>
           <w:rtl w:val="0"/>
+          <w:szCs w:val="19"/>
+          <w:bCs w:val="1"/>
+          <w:lang w:val="en-US"/>
         </w:rPr>
         <w:t xml:space="preserve">which is what they innovate through analysis. </w:t>
       </w:r>
@@ -2212,15 +2704,21 @@
           <w:b w:val="0"/>
           <w:sz w:val="19"/>
           <w:rtl w:val="1"/>
+          <w:szCs w:val="19"/>
+          <w:bCs w:val="0"/>
+          <w:lang w:val="he-IL" w:bidi="he-IL"/>
         </w:rPr>
         <w:t xml:space="preserve">וּבֶאֱמֶת גַּם זֶה "דִּבְרֵי אֱלֹהִים חַיִּים", </w:t>
       </w:r>
       <w:r>
         <w:rPr>
           <w:rFonts w:ascii="Times New Roman" w:hAnsi="Times New Roman" w:eastAsia="Times New Roman" w:cs="Times New Roman"/>
-          <w:b/>
+          <w:b w:val="1"/>
           <w:sz w:val="19"/>
           <w:rtl w:val="0"/>
+          <w:szCs w:val="19"/>
+          <w:bCs w:val="1"/>
+          <w:lang w:val="en-US"/>
         </w:rPr>
         <w:t xml:space="preserve">And in truth, these too are the 'words of the living God,' </w:t>
       </w:r>
@@ -2233,15 +2731,21 @@
           <w:b w:val="0"/>
           <w:sz w:val="19"/>
           <w:rtl w:val="1"/>
+          <w:szCs w:val="19"/>
+          <w:bCs w:val="0"/>
+          <w:lang w:val="he-IL" w:bidi="he-IL"/>
         </w:rPr>
         <w:t xml:space="preserve">כְּמוֹ שֶׁנֶּאֱמַר (בְּעֵירוּבִין יג:) וְכֵן אִיתָא (בָּבָא בַּתְרָא יב.), </w:t>
       </w:r>
       <w:r>
         <w:rPr>
           <w:rFonts w:ascii="Times New Roman" w:hAnsi="Times New Roman" w:eastAsia="Times New Roman" w:cs="Times New Roman"/>
-          <w:b/>
+          <w:b w:val="1"/>
           <w:sz w:val="19"/>
           <w:rtl w:val="0"/>
+          <w:szCs w:val="19"/>
+          <w:bCs w:val="1"/>
+          <w:lang w:val="en-US"/>
         </w:rPr>
         <w:t xml:space="preserve">as stated (in Eruvin 13b) and so brought (Bava Batra 12a), </w:t>
       </w:r>
@@ -2269,15 +2773,21 @@
           <w:b w:val="0"/>
           <w:sz w:val="19"/>
           <w:rtl w:val="1"/>
+          <w:szCs w:val="19"/>
+          <w:bCs w:val="0"/>
+          <w:lang w:val="he-IL" w:bidi="he-IL"/>
         </w:rPr>
         <w:t xml:space="preserve">וְעַיֵּין שָׁם בָּרַמְבַּ״ן דְּהוּא בְּרוּחַ הַקֹּדֶשׁ וְעָדִיף מִנְּבוּאָה. </w:t>
       </w:r>
       <w:r>
         <w:rPr>
           <w:rFonts w:ascii="Times New Roman" w:hAnsi="Times New Roman" w:eastAsia="Times New Roman" w:cs="Times New Roman"/>
-          <w:b/>
+          <w:b w:val="1"/>
           <w:sz w:val="19"/>
           <w:rtl w:val="0"/>
+          <w:szCs w:val="19"/>
+          <w:bCs w:val="1"/>
+          <w:lang w:val="en-US"/>
         </w:rPr>
         <w:t xml:space="preserve">and see there in the Ramban that it stems from the Holy Spirit and is superior to prophecy. </w:t>
       </w:r>
@@ -2290,15 +2800,21 @@
           <w:b w:val="0"/>
           <w:sz w:val="19"/>
           <w:rtl w:val="1"/>
+          <w:szCs w:val="19"/>
+          <w:bCs w:val="0"/>
+          <w:lang w:val="he-IL" w:bidi="he-IL"/>
         </w:rPr>
         <w:t xml:space="preserve">אֲבָל מִכָּל מָקוֹם הַשֵּׁם יִתְבָּרַךְ מָסַר זֶה לַחֲכָמִים </w:t>
       </w:r>
       <w:r>
         <w:rPr>
           <w:rFonts w:ascii="Times New Roman" w:hAnsi="Times New Roman" w:eastAsia="Times New Roman" w:cs="Times New Roman"/>
-          <w:b/>
+          <w:b w:val="1"/>
           <w:sz w:val="19"/>
           <w:rtl w:val="0"/>
+          <w:szCs w:val="19"/>
+          <w:bCs w:val="1"/>
+          <w:lang w:val="en-US"/>
         </w:rPr>
         <w:t xml:space="preserve">Nevertheless, Hashem delivered this over to the Sages </w:t>
       </w:r>
@@ -2311,15 +2827,21 @@
           <w:b w:val="0"/>
           <w:sz w:val="19"/>
           <w:rtl w:val="1"/>
+          <w:szCs w:val="19"/>
+          <w:bCs w:val="0"/>
+          <w:lang w:val="he-IL" w:bidi="he-IL"/>
         </w:rPr>
         <w:t xml:space="preserve">כְּאִילּוּ הֵם הַמְּאִירִים זֶה, </w:t>
       </w:r>
       <w:r>
         <w:rPr>
           <w:rFonts w:ascii="Times New Roman" w:hAnsi="Times New Roman" w:eastAsia="Times New Roman" w:cs="Times New Roman"/>
-          <w:b/>
+          <w:b w:val="1"/>
           <w:sz w:val="19"/>
           <w:rtl w:val="0"/>
+          <w:szCs w:val="19"/>
+          <w:bCs w:val="1"/>
+          <w:lang w:val="en-US"/>
         </w:rPr>
         <w:t xml:space="preserve">as if they are the ones generating this illumination; </w:t>
       </w:r>
@@ -2332,15 +2854,21 @@
           <w:b w:val="0"/>
           <w:sz w:val="19"/>
           <w:rtl w:val="1"/>
+          <w:szCs w:val="19"/>
+          <w:bCs w:val="0"/>
+          <w:lang w:val="he-IL" w:bidi="he-IL"/>
         </w:rPr>
         <w:t xml:space="preserve">וְעַל יְדֵי שֶׁ"בָא אוֹרֵךְ" – </w:t>
       </w:r>
       <w:r>
         <w:rPr>
           <w:rFonts w:ascii="Times New Roman" w:hAnsi="Times New Roman" w:eastAsia="Times New Roman" w:cs="Times New Roman"/>
-          <w:b/>
+          <w:b w:val="1"/>
           <w:sz w:val="19"/>
           <w:rtl w:val="0"/>
+          <w:szCs w:val="19"/>
+          <w:bCs w:val="1"/>
+          <w:lang w:val="en-US"/>
         </w:rPr>
         <w:t xml:space="preserve">and by virtue of 'your light has come'— </w:t>
       </w:r>
@@ -2353,15 +2881,21 @@
           <w:b w:val="0"/>
           <w:sz w:val="19"/>
           <w:rtl w:val="1"/>
+          <w:szCs w:val="19"/>
+          <w:bCs w:val="0"/>
+          <w:lang w:val="he-IL" w:bidi="he-IL"/>
         </w:rPr>
         <w:t xml:space="preserve">מַה שֶּׁהַשֵּׁם יִתְבָּרַךְ מֵאִיר לְלִבָּם, </w:t>
       </w:r>
       <w:r>
         <w:rPr>
           <w:rFonts w:ascii="Times New Roman" w:hAnsi="Times New Roman" w:eastAsia="Times New Roman" w:cs="Times New Roman"/>
-          <w:b/>
+          <w:b w:val="1"/>
           <w:sz w:val="19"/>
           <w:rtl w:val="0"/>
+          <w:szCs w:val="19"/>
+          <w:bCs w:val="1"/>
+          <w:lang w:val="en-US"/>
         </w:rPr>
         <w:t xml:space="preserve">that which Hashem shines into their hearts, </w:t>
       </w:r>
@@ -2374,15 +2908,21 @@
           <w:b w:val="0"/>
           <w:sz w:val="19"/>
           <w:rtl w:val="1"/>
+          <w:szCs w:val="19"/>
+          <w:bCs w:val="0"/>
+          <w:lang w:val="he-IL" w:bidi="he-IL"/>
         </w:rPr>
         <w:t xml:space="preserve">עַל יְדֵי זֶה הֵם מְאִירִים לְפָנָיו יִתְבָּרַךְ. </w:t>
       </w:r>
       <w:r>
         <w:rPr>
           <w:rFonts w:ascii="Times New Roman" w:hAnsi="Times New Roman" w:eastAsia="Times New Roman" w:cs="Times New Roman"/>
-          <w:b/>
+          <w:b w:val="1"/>
           <w:sz w:val="19"/>
           <w:rtl w:val="0"/>
+          <w:szCs w:val="19"/>
+          <w:bCs w:val="1"/>
+          <w:lang w:val="en-US"/>
         </w:rPr>
         <w:t xml:space="preserve">thereby they shine back before Him. </w:t>
       </w:r>
@@ -2395,15 +2935,21 @@
           <w:b w:val="0"/>
           <w:sz w:val="19"/>
           <w:rtl w:val="1"/>
+          <w:szCs w:val="19"/>
+          <w:bCs w:val="0"/>
+          <w:lang w:val="he-IL" w:bidi="he-IL"/>
         </w:rPr>
         <w:t xml:space="preserve">וְאָמַר "קוּמִי אוֹרִי" תְּחִלָּה, </w:t>
       </w:r>
       <w:r>
         <w:rPr>
           <w:rFonts w:ascii="Times New Roman" w:hAnsi="Times New Roman" w:eastAsia="Times New Roman" w:cs="Times New Roman"/>
-          <w:b/>
+          <w:b w:val="1"/>
           <w:sz w:val="19"/>
           <w:rtl w:val="0"/>
+          <w:szCs w:val="19"/>
+          <w:bCs w:val="1"/>
+          <w:lang w:val="en-US"/>
         </w:rPr>
         <w:t xml:space="preserve">And Scripture states 'Arise, shine' first, </w:t>
       </w:r>
@@ -2416,15 +2962,21 @@
           <w:b w:val="0"/>
           <w:sz w:val="19"/>
           <w:rtl w:val="1"/>
+          <w:szCs w:val="19"/>
+          <w:bCs w:val="0"/>
+          <w:lang w:val="he-IL" w:bidi="he-IL"/>
         </w:rPr>
         <w:t xml:space="preserve">דִּבְהִתְגַּלּוּת הֵם הַמְּאִירִים בְּעַצְמָם. </w:t>
       </w:r>
       <w:r>
         <w:rPr>
           <w:rFonts w:ascii="Times New Roman" w:hAnsi="Times New Roman" w:eastAsia="Times New Roman" w:cs="Times New Roman"/>
-          <w:b/>
+          <w:b w:val="1"/>
           <w:sz w:val="19"/>
           <w:rtl w:val="0"/>
+          <w:szCs w:val="19"/>
+          <w:bCs w:val="1"/>
+          <w:lang w:val="en-US"/>
         </w:rPr>
         <w:t xml:space="preserve">for in overt manifestation they are the ones actively illuminating. </w:t>
       </w:r>
@@ -2437,15 +2989,21 @@
           <w:b w:val="0"/>
           <w:sz w:val="19"/>
           <w:rtl w:val="1"/>
+          <w:szCs w:val="19"/>
+          <w:bCs w:val="0"/>
+          <w:lang w:val="he-IL" w:bidi="he-IL"/>
         </w:rPr>
         <w:t xml:space="preserve">וְעַל זֶה אָמַר בַּמִּדְרָשׁ שָׁם: "לְמַעֲשֵׂה יָדֶיךָ תִכְסֹף", </w:t>
       </w:r>
       <w:r>
         <w:rPr>
           <w:rFonts w:ascii="Times New Roman" w:hAnsi="Times New Roman" w:eastAsia="Times New Roman" w:cs="Times New Roman"/>
-          <w:b/>
+          <w:b w:val="1"/>
           <w:sz w:val="19"/>
           <w:rtl w:val="0"/>
+          <w:szCs w:val="19"/>
+          <w:bCs w:val="1"/>
+          <w:lang w:val="en-US"/>
         </w:rPr>
         <w:t xml:space="preserve">And upon this the Midrash stated: 'You will yearn for the work of Your hands,'— </w:t>
       </w:r>
@@ -2473,15 +3031,21 @@
           <w:b w:val="0"/>
           <w:sz w:val="19"/>
           <w:rtl w:val="1"/>
+          <w:szCs w:val="19"/>
+          <w:bCs w:val="0"/>
+          <w:lang w:val="he-IL" w:bidi="he-IL"/>
         </w:rPr>
         <w:t xml:space="preserve">שֶׁהַשֵּׁם יִתְבָּרַךְ מִתְאַוֶּה לָהֶם </w:t>
       </w:r>
       <w:r>
         <w:rPr>
           <w:rFonts w:ascii="Times New Roman" w:hAnsi="Times New Roman" w:eastAsia="Times New Roman" w:cs="Times New Roman"/>
-          <w:b/>
+          <w:b w:val="1"/>
           <w:sz w:val="19"/>
           <w:rtl w:val="0"/>
+          <w:szCs w:val="19"/>
+          <w:bCs w:val="1"/>
+          <w:lang w:val="en-US"/>
         </w:rPr>
         <w:t xml:space="preserve">that Hashem yearns for them, </w:t>
       </w:r>
@@ -2499,15 +3063,21 @@
           <w:b w:val="0"/>
           <w:sz w:val="19"/>
           <w:rtl w:val="1"/>
+          <w:szCs w:val="19"/>
+          <w:bCs w:val="0"/>
+          <w:lang w:val="he-IL" w:bidi="he-IL"/>
         </w:rPr>
         <w:t xml:space="preserve">שֶׁיִּהְיֶה נִקְרָא עַל שֵׁם בְּנֵי יִשְׂרָאֵל שֶׁהֵם הַמְּאִירִים. </w:t>
       </w:r>
       <w:r>
         <w:rPr>
           <w:rFonts w:ascii="Times New Roman" w:hAnsi="Times New Roman" w:eastAsia="Times New Roman" w:cs="Times New Roman"/>
-          <w:b/>
+          <w:b w:val="1"/>
           <w:sz w:val="19"/>
           <w:rtl w:val="0"/>
+          <w:szCs w:val="19"/>
+          <w:bCs w:val="1"/>
+          <w:lang w:val="en-US"/>
         </w:rPr>
         <w:t xml:space="preserve">that it be ascribed to the children of Israel, that they are the luminaries. </w:t>
       </w:r>
@@ -2520,15 +3090,21 @@
           <w:b w:val="0"/>
           <w:sz w:val="19"/>
           <w:rtl w:val="1"/>
+          <w:szCs w:val="19"/>
+          <w:bCs w:val="0"/>
+          <w:lang w:val="he-IL" w:bidi="he-IL"/>
         </w:rPr>
         <w:t xml:space="preserve">וְדָבָר זֶה הוּא חֲנֻכַּת אַהֲרֹן, </w:t>
       </w:r>
       <w:r>
         <w:rPr>
           <w:rFonts w:ascii="Times New Roman" w:hAnsi="Times New Roman" w:eastAsia="Times New Roman" w:cs="Times New Roman"/>
-          <w:b/>
+          <w:b w:val="1"/>
           <w:sz w:val="19"/>
           <w:rtl w:val="0"/>
+          <w:szCs w:val="19"/>
+          <w:bCs w:val="1"/>
+          <w:lang w:val="en-US"/>
         </w:rPr>
         <w:t xml:space="preserve">And this matter is the dedication of Aaron, </w:t>
       </w:r>
@@ -2541,15 +3117,21 @@
           <w:b w:val="0"/>
           <w:sz w:val="19"/>
           <w:rtl w:val="1"/>
+          <w:szCs w:val="19"/>
+          <w:bCs w:val="0"/>
+          <w:lang w:val="he-IL" w:bidi="he-IL"/>
         </w:rPr>
         <w:t xml:space="preserve">כְּמוֹ שֶׁנֶּאֱמַר בַּמִּדְרָשׁ (רֵישׁ פָּרָשַׁת בְּהַעֲלֹתְךָ), </w:t>
       </w:r>
       <w:r>
         <w:rPr>
           <w:rFonts w:ascii="Times New Roman" w:hAnsi="Times New Roman" w:eastAsia="Times New Roman" w:cs="Times New Roman"/>
-          <w:b/>
+          <w:b w:val="1"/>
           <w:sz w:val="19"/>
           <w:rtl w:val="0"/>
+          <w:szCs w:val="19"/>
+          <w:bCs w:val="1"/>
+          <w:lang w:val="en-US"/>
         </w:rPr>
         <w:t xml:space="preserve">as stated in the Midrash (beginning of Parashat Beha'alotekha), </w:t>
       </w:r>
@@ -2562,15 +3144,21 @@
           <w:b w:val="0"/>
           <w:sz w:val="19"/>
           <w:rtl w:val="1"/>
+          <w:szCs w:val="19"/>
+          <w:bCs w:val="0"/>
+          <w:lang w:val="he-IL" w:bidi="he-IL"/>
         </w:rPr>
         <w:t xml:space="preserve">כִּי הוּא הַשּׁוֹרֶשׁ דְּתוֹרָה שֶׁבְּעַל פֶּה, </w:t>
       </w:r>
       <w:r>
         <w:rPr>
           <w:rFonts w:ascii="Times New Roman" w:hAnsi="Times New Roman" w:eastAsia="Times New Roman" w:cs="Times New Roman"/>
-          <w:b/>
+          <w:b w:val="1"/>
           <w:sz w:val="19"/>
           <w:rtl w:val="0"/>
+          <w:szCs w:val="19"/>
+          <w:bCs w:val="1"/>
+          <w:lang w:val="en-US"/>
         </w:rPr>
         <w:t xml:space="preserve">for he is the root of the Oral Torah, </w:t>
       </w:r>
@@ -2583,15 +3171,21 @@
           <w:b w:val="0"/>
           <w:sz w:val="19"/>
           <w:rtl w:val="1"/>
+          <w:szCs w:val="19"/>
+          <w:bCs w:val="0"/>
+          <w:lang w:val="he-IL" w:bidi="he-IL"/>
         </w:rPr>
         <w:t xml:space="preserve">כְּמוֹ שֶׁנֶּאֱמַר: "יוֹרוּ מִשְׁפָּטֶיךָ לְיַעֲקֹב" וְגוֹמֵר, </w:t>
       </w:r>
       <w:r>
         <w:rPr>
           <w:rFonts w:ascii="Times New Roman" w:hAnsi="Times New Roman" w:eastAsia="Times New Roman" w:cs="Times New Roman"/>
-          <w:b/>
+          <w:b w:val="1"/>
           <w:sz w:val="19"/>
           <w:rtl w:val="0"/>
+          <w:szCs w:val="19"/>
+          <w:bCs w:val="1"/>
+          <w:lang w:val="en-US"/>
         </w:rPr>
         <w:t xml:space="preserve">as it is said: 'They shall teach Your judgments to Jacob, etc.', </w:t>
       </w:r>
@@ -2619,15 +3213,21 @@
           <w:b w:val="0"/>
           <w:sz w:val="19"/>
           <w:rtl w:val="1"/>
+          <w:szCs w:val="19"/>
+          <w:bCs w:val="0"/>
+          <w:lang w:val="he-IL" w:bidi="he-IL"/>
         </w:rPr>
         <w:t xml:space="preserve">וְנֶאֱמַר: "וּבָאתָ אֶל הַכֹּהֲנִים" וְגוֹמֵר "עַל פִּי הַתּוֹרָה אֲשֶׁר יוֹרוּךָ" וְגוֹמֵר, </w:t>
       </w:r>
       <w:r>
         <w:rPr>
           <w:rFonts w:ascii="Times New Roman" w:hAnsi="Times New Roman" w:eastAsia="Times New Roman" w:cs="Times New Roman"/>
-          <w:b/>
+          <w:b w:val="1"/>
           <w:sz w:val="19"/>
           <w:rtl w:val="0"/>
+          <w:szCs w:val="19"/>
+          <w:bCs w:val="1"/>
+          <w:lang w:val="en-US"/>
         </w:rPr>
         <w:t xml:space="preserve">and said: 'And you shall come unto the priests... according to the Torah they teach you, etc.', </w:t>
       </w:r>
@@ -2640,15 +3240,21 @@
           <w:b w:val="0"/>
           <w:sz w:val="19"/>
           <w:rtl w:val="1"/>
+          <w:szCs w:val="19"/>
+          <w:bCs w:val="0"/>
+          <w:lang w:val="he-IL" w:bidi="he-IL"/>
         </w:rPr>
         <w:t xml:space="preserve">וְנֶאֱמַר: "שִׂפְתֵי כֹהֵן" וְגוֹמֵר "וְתוֹרָה יְבַקְשׁוּ מִפִּיהוּ" וְגוֹמֵר. </w:t>
       </w:r>
       <w:r>
         <w:rPr>
           <w:rFonts w:ascii="Times New Roman" w:hAnsi="Times New Roman" w:eastAsia="Times New Roman" w:cs="Times New Roman"/>
-          <w:b/>
+          <w:b w:val="1"/>
           <w:sz w:val="19"/>
           <w:rtl w:val="0"/>
+          <w:szCs w:val="19"/>
+          <w:bCs w:val="1"/>
+          <w:lang w:val="en-US"/>
         </w:rPr>
         <w:t xml:space="preserve">and said: 'The lips of the priest... and they shall seek Torah from his mouth, etc.' </w:t>
       </w:r>
@@ -2705,15 +3311,21 @@
           <w:b w:val="0"/>
           <w:sz w:val="19"/>
           <w:rtl w:val="1"/>
+          <w:szCs w:val="19"/>
+          <w:bCs w:val="0"/>
+          <w:lang w:val="he-IL" w:bidi="he-IL"/>
         </w:rPr>
         <w:t xml:space="preserve">וְחַמָּה וּלְבָנָה רוֹמְזִים גַּם כֵּן לְתוֹרָה שֶׁבִּכְתָב וְתוֹרָה שֶׁבְּעַל פֶּה, </w:t>
       </w:r>
       <w:r>
         <w:rPr>
           <w:rFonts w:ascii="Times New Roman" w:hAnsi="Times New Roman" w:eastAsia="Times New Roman" w:cs="Times New Roman"/>
-          <w:b/>
+          <w:b w:val="1"/>
           <w:sz w:val="19"/>
           <w:rtl w:val="0"/>
+          <w:szCs w:val="19"/>
+          <w:bCs w:val="1"/>
+          <w:lang w:val="en-US"/>
         </w:rPr>
         <w:t xml:space="preserve">And the sun and the moon likewise allude to the Written Torah and Oral Torah, </w:t>
       </w:r>
@@ -2726,15 +3338,21 @@
           <w:b w:val="0"/>
           <w:sz w:val="19"/>
           <w:rtl w:val="1"/>
+          <w:szCs w:val="19"/>
+          <w:bCs w:val="0"/>
+          <w:lang w:val="he-IL" w:bidi="he-IL"/>
         </w:rPr>
         <w:t xml:space="preserve">דִּמְקַבְּלִים הָאוֹר מִתּוֹרָה שֶׁבִּכְתָב. </w:t>
       </w:r>
       <w:r>
         <w:rPr>
           <w:rFonts w:ascii="Times New Roman" w:hAnsi="Times New Roman" w:eastAsia="Times New Roman" w:cs="Times New Roman"/>
-          <w:b/>
+          <w:b w:val="1"/>
           <w:sz w:val="19"/>
           <w:rtl w:val="0"/>
+          <w:szCs w:val="19"/>
+          <w:bCs w:val="1"/>
+          <w:lang w:val="en-US"/>
         </w:rPr>
         <w:t xml:space="preserve">since they receive the illumination from the Written Torah. </w:t>
       </w:r>
@@ -2747,15 +3365,21 @@
           <w:b w:val="0"/>
           <w:sz w:val="19"/>
           <w:rtl w:val="1"/>
+          <w:szCs w:val="19"/>
+          <w:bCs w:val="0"/>
+          <w:lang w:val="he-IL" w:bidi="he-IL"/>
         </w:rPr>
         <w:t xml:space="preserve">וְעַל כֵּן אָמְרוּ בְּמִדְרַשׁ הַנֶּעֱלָם (זֹהַר חֵלֶק א, צז עַמּוּד ב): </w:t>
       </w:r>
       <w:r>
         <w:rPr>
           <w:rFonts w:ascii="Times New Roman" w:hAnsi="Times New Roman" w:eastAsia="Times New Roman" w:cs="Times New Roman"/>
-          <w:b/>
+          <w:b w:val="1"/>
           <w:sz w:val="19"/>
           <w:rtl w:val="0"/>
+          <w:szCs w:val="19"/>
+          <w:bCs w:val="1"/>
+          <w:lang w:val="en-US"/>
         </w:rPr>
         <w:t xml:space="preserve">And therefore they stated in the Midrash HaNe'elam (Zohar Part I, 97b): </w:t>
       </w:r>
@@ -2774,15 +3398,21 @@
           <w:b w:val="0"/>
           <w:sz w:val="19"/>
           <w:rtl w:val="1"/>
+          <w:szCs w:val="19"/>
+          <w:bCs w:val="0"/>
+          <w:lang w:val="he-IL" w:bidi="he-IL"/>
         </w:rPr>
         <w:t xml:space="preserve">דְּהַקָּדוֹשׁ בָּרוּךְ הוּא בָּא בְּרֹאשׁ חֹדֶשׁ </w:t>
       </w:r>
       <w:r>
         <w:rPr>
           <w:rFonts w:ascii="Times New Roman" w:hAnsi="Times New Roman" w:eastAsia="Times New Roman" w:cs="Times New Roman"/>
-          <w:b/>
+          <w:b w:val="1"/>
           <w:sz w:val="19"/>
           <w:rtl w:val="0"/>
+          <w:szCs w:val="19"/>
+          <w:bCs w:val="1"/>
+          <w:lang w:val="en-US"/>
         </w:rPr>
         <w:t xml:space="preserve">that the Holy One comes on Rosh Chodesh </w:t>
       </w:r>
@@ -2795,15 +3425,21 @@
           <w:b w:val="0"/>
           <w:sz w:val="19"/>
           <w:rtl w:val="1"/>
+          <w:szCs w:val="19"/>
+          <w:bCs w:val="0"/>
+          <w:lang w:val="he-IL" w:bidi="he-IL"/>
         </w:rPr>
         <w:t xml:space="preserve">לְמִשְׁמַע אוּלְפָן מִנִּשְׁמָתְהוֹן דְּצַדִּיקַיָּא, </w:t>
       </w:r>
       <w:r>
         <w:rPr>
           <w:rFonts w:ascii="Times New Roman" w:hAnsi="Times New Roman" w:eastAsia="Times New Roman" w:cs="Times New Roman"/>
-          <w:b/>
+          <w:b w:val="1"/>
           <w:sz w:val="19"/>
           <w:rtl w:val="0"/>
+          <w:szCs w:val="19"/>
+          <w:bCs w:val="1"/>
+          <w:lang w:val="en-US"/>
         </w:rPr>
         <w:t xml:space="preserve">to hear teachings of Torah from the souls of the righteous, </w:t>
       </w:r>
@@ -2816,15 +3452,21 @@
           <w:b w:val="0"/>
           <w:sz w:val="19"/>
           <w:rtl w:val="1"/>
+          <w:szCs w:val="19"/>
+          <w:bCs w:val="0"/>
+          <w:lang w:val="he-IL" w:bidi="he-IL"/>
         </w:rPr>
         <w:t xml:space="preserve">שֶׁאָז הוּא הֶאָרַת הָאוֹר דְּתוֹרָה שֶׁבְּעַל פֶּה </w:t>
       </w:r>
       <w:r>
         <w:rPr>
           <w:rFonts w:ascii="Times New Roman" w:hAnsi="Times New Roman" w:eastAsia="Times New Roman" w:cs="Times New Roman"/>
-          <w:b/>
+          <w:b w:val="1"/>
           <w:sz w:val="19"/>
           <w:rtl w:val="0"/>
+          <w:szCs w:val="19"/>
+          <w:bCs w:val="1"/>
+          <w:lang w:val="en-US"/>
         </w:rPr>
         <w:t xml:space="preserve">for then shines the illumination of the Oral Torah, </w:t>
       </w:r>
@@ -2837,15 +3479,21 @@
           <w:b w:val="0"/>
           <w:sz w:val="19"/>
           <w:rtl w:val="1"/>
+          <w:szCs w:val="19"/>
+          <w:bCs w:val="0"/>
+          <w:lang w:val="he-IL" w:bidi="he-IL"/>
         </w:rPr>
         <w:t xml:space="preserve">וְהַשֵּׁם יִתְבָּרַךְ יִכְסֹף לְמַעֲשֵׂה יָדָיו; </w:t>
       </w:r>
       <w:r>
         <w:rPr>
           <w:rFonts w:ascii="Times New Roman" w:hAnsi="Times New Roman" w:eastAsia="Times New Roman" w:cs="Times New Roman"/>
-          <w:b/>
+          <w:b w:val="1"/>
           <w:sz w:val="19"/>
           <w:rtl w:val="0"/>
+          <w:szCs w:val="19"/>
+          <w:bCs w:val="1"/>
+          <w:lang w:val="en-US"/>
         </w:rPr>
         <w:t xml:space="preserve">and Hashem yearns for the work of His hands; </w:t>
       </w:r>
@@ -2858,15 +3506,21 @@
           <w:b w:val="0"/>
           <w:sz w:val="19"/>
           <w:rtl w:val="1"/>
+          <w:szCs w:val="19"/>
+          <w:bCs w:val="0"/>
+          <w:lang w:val="he-IL" w:bidi="he-IL"/>
         </w:rPr>
         <w:t xml:space="preserve">וְעַל כֵּן מָסַר קִדּוּשׁ הַחֹדֶשׁ לַחֲכָמִים, </w:t>
       </w:r>
       <w:r>
         <w:rPr>
           <w:rFonts w:ascii="Times New Roman" w:hAnsi="Times New Roman" w:eastAsia="Times New Roman" w:cs="Times New Roman"/>
-          <w:b/>
+          <w:b w:val="1"/>
           <w:sz w:val="19"/>
           <w:rtl w:val="0"/>
+          <w:szCs w:val="19"/>
+          <w:bCs w:val="1"/>
+          <w:lang w:val="en-US"/>
         </w:rPr>
         <w:t xml:space="preserve">and therefore He handed the sanctification of the New Moon to the Sages, </w:t>
       </w:r>
@@ -2879,15 +3533,21 @@
           <w:b w:val="0"/>
           <w:sz w:val="19"/>
           <w:rtl w:val="1"/>
+          <w:szCs w:val="19"/>
+          <w:bCs w:val="0"/>
+          <w:lang w:val="he-IL" w:bidi="he-IL"/>
         </w:rPr>
         <w:t xml:space="preserve">כִּי הֵם הַמְּאִירִים אוֹר דְּתוֹרָה שֶׁבְּעַל פֶּה. </w:t>
       </w:r>
       <w:r>
         <w:rPr>
           <w:rFonts w:ascii="Times New Roman" w:hAnsi="Times New Roman" w:eastAsia="Times New Roman" w:cs="Times New Roman"/>
-          <w:b/>
+          <w:b w:val="1"/>
           <w:sz w:val="19"/>
           <w:rtl w:val="0"/>
+          <w:szCs w:val="19"/>
+          <w:bCs w:val="1"/>
+          <w:lang w:val="en-US"/>
         </w:rPr>
         <w:t xml:space="preserve">for they are the ones who radiate the light of the Oral Torah. </w:t>
       </w:r>
@@ -2900,15 +3560,21 @@
           <w:b w:val="0"/>
           <w:sz w:val="19"/>
           <w:rtl w:val="1"/>
+          <w:szCs w:val="19"/>
+          <w:bCs w:val="0"/>
+          <w:lang w:val="he-IL" w:bidi="he-IL"/>
         </w:rPr>
         <w:t xml:space="preserve">וְזֶה הִתְגַּלּוּת הַשְּׁכִינָה בְּלִבּוֹת בְּנֵי יִשְׂרָאֵל, </w:t>
       </w:r>
       <w:r>
         <w:rPr>
           <w:rFonts w:ascii="Times New Roman" w:hAnsi="Times New Roman" w:eastAsia="Times New Roman" w:cs="Times New Roman"/>
-          <w:b/>
+          <w:b w:val="1"/>
           <w:sz w:val="19"/>
           <w:rtl w:val="0"/>
+          <w:szCs w:val="19"/>
+          <w:bCs w:val="1"/>
+          <w:lang w:val="en-US"/>
         </w:rPr>
         <w:t xml:space="preserve">And this is the revelation of the Shekhinah within the hearts of Israel, </w:t>
       </w:r>
@@ -2921,15 +3587,21 @@
           <w:b w:val="0"/>
           <w:sz w:val="19"/>
           <w:rtl w:val="1"/>
+          <w:szCs w:val="19"/>
+          <w:bCs w:val="0"/>
+          <w:lang w:val="he-IL" w:bidi="he-IL"/>
         </w:rPr>
         <w:t xml:space="preserve">דְּזֶהוּ כָּל עִנְיַן אוֹר תּוֹרָה: </w:t>
       </w:r>
       <w:r>
         <w:rPr>
           <w:rFonts w:ascii="Times New Roman" w:hAnsi="Times New Roman" w:eastAsia="Times New Roman" w:cs="Times New Roman"/>
-          <w:b/>
+          <w:b w:val="1"/>
           <w:sz w:val="19"/>
           <w:rtl w:val="0"/>
+          <w:szCs w:val="19"/>
+          <w:bCs w:val="1"/>
+          <w:lang w:val="en-US"/>
         </w:rPr>
         <w:t xml:space="preserve">for this is the essence of the light of Torah: </w:t>
       </w:r>
@@ -2942,15 +3614,21 @@
           <w:b w:val="0"/>
           <w:sz w:val="19"/>
           <w:rtl w:val="1"/>
+          <w:szCs w:val="19"/>
+          <w:bCs w:val="0"/>
+          <w:lang w:val="he-IL" w:bidi="he-IL"/>
         </w:rPr>
         <w:t xml:space="preserve">לְהָאִיר לַלֵּב בְּדַעַת אֱלֹהִים, </w:t>
       </w:r>
       <w:r>
         <w:rPr>
           <w:rFonts w:ascii="Times New Roman" w:hAnsi="Times New Roman" w:eastAsia="Times New Roman" w:cs="Times New Roman"/>
-          <w:b/>
+          <w:b w:val="1"/>
           <w:sz w:val="19"/>
           <w:rtl w:val="0"/>
+          <w:szCs w:val="19"/>
+          <w:bCs w:val="1"/>
+          <w:lang w:val="en-US"/>
         </w:rPr>
         <w:t xml:space="preserve">to illuminate the heart with the knowledge of God, </w:t>
       </w:r>
@@ -2968,15 +3646,21 @@
           <w:b w:val="0"/>
           <w:sz w:val="19"/>
           <w:rtl w:val="1"/>
+          <w:szCs w:val="19"/>
+          <w:bCs w:val="0"/>
+          <w:lang w:val="he-IL" w:bidi="he-IL"/>
         </w:rPr>
         <w:t xml:space="preserve">וּכְמוֹ שֶׁנֶּאֱמַר לֶעָתִיד: "וְלֹא יְלַמְּדוּ עוֹד אִישׁ אֶת רֵעֵהוּ </w:t>
       </w:r>
       <w:r>
         <w:rPr>
           <w:rFonts w:ascii="Times New Roman" w:hAnsi="Times New Roman" w:eastAsia="Times New Roman" w:cs="Times New Roman"/>
-          <w:b/>
+          <w:b w:val="1"/>
           <w:sz w:val="19"/>
           <w:rtl w:val="0"/>
+          <w:szCs w:val="19"/>
+          <w:bCs w:val="1"/>
+          <w:lang w:val="en-US"/>
         </w:rPr>
         <w:t xml:space="preserve">as is stated regarding the ultimate future: 'And they shall no more teach every man his neighbor, </w:t>
       </w:r>
@@ -3004,15 +3688,21 @@
           <w:b w:val="0"/>
           <w:sz w:val="19"/>
           <w:rtl w:val="1"/>
+          <w:szCs w:val="19"/>
+          <w:bCs w:val="0"/>
+          <w:lang w:val="he-IL" w:bidi="he-IL"/>
         </w:rPr>
         <w:t xml:space="preserve">כִּי כוּלָּם יֵדְעוּ אוֹתִי" וְגוֹמֵר. </w:t>
       </w:r>
       <w:r>
         <w:rPr>
           <w:rFonts w:ascii="Times New Roman" w:hAnsi="Times New Roman" w:eastAsia="Times New Roman" w:cs="Times New Roman"/>
-          <w:b/>
+          <w:b w:val="1"/>
           <w:sz w:val="19"/>
           <w:rtl w:val="0"/>
+          <w:szCs w:val="19"/>
+          <w:bCs w:val="1"/>
+          <w:lang w:val="en-US"/>
         </w:rPr>
         <w:t xml:space="preserve">for they shall all know Me, etc.' </w:t>
       </w:r>
@@ -3025,15 +3715,21 @@
           <w:b w:val="0"/>
           <w:sz w:val="19"/>
           <w:rtl w:val="1"/>
+          <w:szCs w:val="19"/>
+          <w:bCs w:val="0"/>
+          <w:lang w:val="he-IL" w:bidi="he-IL"/>
         </w:rPr>
         <w:t xml:space="preserve">וְדָוִד הַמֶּלֶךְ עָלָיו הַשָּׁלוֹם אָמַר לִשְׁלֹמֹה הַמֶּלֶךְ עָלָיו הַשָּׁלוֹם, </w:t>
       </w:r>
       <w:r>
         <w:rPr>
           <w:rFonts w:ascii="Times New Roman" w:hAnsi="Times New Roman" w:eastAsia="Times New Roman" w:cs="Times New Roman"/>
-          <w:b/>
+          <w:b w:val="1"/>
           <w:sz w:val="19"/>
           <w:rtl w:val="0"/>
+          <w:szCs w:val="19"/>
+          <w:bCs w:val="1"/>
+          <w:lang w:val="en-US"/>
         </w:rPr>
         <w:t xml:space="preserve">And King David, peace be upon him, said to King Solomon, peace be upon him, </w:t>
       </w:r>
@@ -3046,15 +3742,21 @@
           <w:b w:val="0"/>
           <w:sz w:val="19"/>
           <w:rtl w:val="1"/>
+          <w:szCs w:val="19"/>
+          <w:bCs w:val="0"/>
+          <w:lang w:val="he-IL" w:bidi="he-IL"/>
         </w:rPr>
         <w:t xml:space="preserve">שֶׁהוּא שׁוֹרֶשׁ הַחָכְמָה תַּתָּאָה דְּתוֹרָה שֶׁבְּעַל פֶּה, </w:t>
       </w:r>
       <w:r>
         <w:rPr>
           <w:rFonts w:ascii="Times New Roman" w:hAnsi="Times New Roman" w:eastAsia="Times New Roman" w:cs="Times New Roman"/>
-          <w:b/>
+          <w:b w:val="1"/>
           <w:sz w:val="19"/>
           <w:rtl w:val="0"/>
+          <w:szCs w:val="19"/>
+          <w:bCs w:val="1"/>
+          <w:lang w:val="en-US"/>
         </w:rPr>
         <w:t xml:space="preserve">who is the root of the lower wisdom of the Oral Torah, </w:t>
       </w:r>
@@ -3067,15 +3769,21 @@
           <w:b w:val="0"/>
           <w:sz w:val="19"/>
           <w:rtl w:val="1"/>
+          <w:szCs w:val="19"/>
+          <w:bCs w:val="0"/>
+          <w:lang w:val="he-IL" w:bidi="he-IL"/>
         </w:rPr>
         <w:t xml:space="preserve">שׁוֹרֶשׁ הַמַּלְכוּת, פֶּה דְּתוֹרָה שֶׁבְּעַל פֶּה, </w:t>
       </w:r>
       <w:r>
         <w:rPr>
           <w:rFonts w:ascii="Times New Roman" w:hAnsi="Times New Roman" w:eastAsia="Times New Roman" w:cs="Times New Roman"/>
-          <w:b/>
+          <w:b w:val="1"/>
           <w:sz w:val="19"/>
           <w:rtl w:val="0"/>
+          <w:szCs w:val="19"/>
+          <w:bCs w:val="1"/>
+          <w:lang w:val="en-US"/>
         </w:rPr>
         <w:t xml:space="preserve">the root of Malchut, the mouth of the Oral Torah, </w:t>
       </w:r>
@@ -3088,17 +3796,23 @@
           <w:b w:val="0"/>
           <w:sz w:val="19"/>
           <w:rtl w:val="1"/>
+          <w:szCs w:val="19"/>
+          <w:bCs w:val="0"/>
+          <w:lang w:val="he-IL" w:bidi="he-IL"/>
         </w:rPr>
         <w:t xml:space="preserve">אָמַר לוֹ: "דַּע אֶת אֱלֹהֵי" וְגוֹמֵר, </w:t>
       </w:r>
       <w:r>
         <w:rPr>
           <w:rFonts w:ascii="Times New Roman" w:hAnsi="Times New Roman" w:eastAsia="Times New Roman" w:cs="Times New Roman"/>
-          <w:b/>
+          <w:b w:val="1"/>
           <w:sz w:val="19"/>
           <w:rtl w:val="0"/>
-        </w:rPr>
-        <w:t xml:space="preserve">saying to him: 'Know the God of your father, etc.', </w:t>
+          <w:szCs w:val="19"/>
+          <w:bCs w:val="1"/>
+          <w:lang w:val="en-US"/>
+        </w:rPr>
+        <w:t xml:space="preserve">saying to him: ‘Know the God of…,’ etc., </w:t>
       </w:r>
       <w:r>
         <w:t xml:space="preserve">  </w:t>
@@ -3109,15 +3823,21 @@
           <w:b w:val="0"/>
           <w:sz w:val="19"/>
           <w:rtl w:val="1"/>
+          <w:szCs w:val="19"/>
+          <w:bCs w:val="0"/>
+          <w:lang w:val="he-IL" w:bidi="he-IL"/>
         </w:rPr>
         <w:t xml:space="preserve">וְזֶהוּ "מִפִּיו דַּעַת וּתְבוּנָה". </w:t>
       </w:r>
       <w:r>
         <w:rPr>
           <w:rFonts w:ascii="Times New Roman" w:hAnsi="Times New Roman" w:eastAsia="Times New Roman" w:cs="Times New Roman"/>
-          <w:b/>
+          <w:b w:val="1"/>
           <w:sz w:val="19"/>
           <w:rtl w:val="0"/>
+          <w:szCs w:val="19"/>
+          <w:bCs w:val="1"/>
+          <w:lang w:val="en-US"/>
         </w:rPr>
         <w:t xml:space="preserve">and this is 'from His mouth come knowledge and understanding.' </w:t>
       </w:r>
@@ -3130,15 +3850,21 @@
           <w:b w:val="0"/>
           <w:sz w:val="19"/>
           <w:rtl w:val="1"/>
+          <w:szCs w:val="19"/>
+          <w:bCs w:val="0"/>
+          <w:lang w:val="he-IL" w:bidi="he-IL"/>
         </w:rPr>
         <w:t xml:space="preserve">וְנֶאֱמַר (מִשְׁלֵי ט, י): "וְדַעַת קְדֹשִׁים בִּינָה", </w:t>
       </w:r>
       <w:r>
         <w:rPr>
           <w:rFonts w:ascii="Times New Roman" w:hAnsi="Times New Roman" w:eastAsia="Times New Roman" w:cs="Times New Roman"/>
-          <w:b/>
+          <w:b w:val="1"/>
           <w:sz w:val="19"/>
           <w:rtl w:val="0"/>
+          <w:szCs w:val="19"/>
+          <w:bCs w:val="1"/>
+          <w:lang w:val="en-US"/>
         </w:rPr>
         <w:t xml:space="preserve">And it is said (Mishlei 9:10): 'and the knowledge of the holy ones is understanding,' </w:t>
       </w:r>
@@ -3166,15 +3892,21 @@
           <w:b w:val="0"/>
           <w:sz w:val="19"/>
           <w:rtl w:val="1"/>
+          <w:szCs w:val="19"/>
+          <w:bCs w:val="0"/>
+          <w:lang w:val="he-IL" w:bidi="he-IL"/>
         </w:rPr>
         <w:t xml:space="preserve">וּבִינָה הוּא תּוֹרָה שֶׁבְּעַל פֶּה, שֶׁמֵּבִין דָּבָר מִתּוֹךְ דָּבָר, </w:t>
       </w:r>
       <w:r>
         <w:rPr>
           <w:rFonts w:ascii="Times New Roman" w:hAnsi="Times New Roman" w:eastAsia="Times New Roman" w:cs="Times New Roman"/>
-          <w:b/>
+          <w:b w:val="1"/>
           <w:sz w:val="19"/>
           <w:rtl w:val="0"/>
+          <w:szCs w:val="19"/>
+          <w:bCs w:val="1"/>
+          <w:lang w:val="en-US"/>
         </w:rPr>
         <w:t xml:space="preserve">and Binah (Understanding) is the Oral Torah, understanding one concept from within another, </w:t>
       </w:r>
@@ -3187,15 +3919,21 @@
           <w:b w:val="0"/>
           <w:sz w:val="19"/>
           <w:rtl w:val="1"/>
+          <w:szCs w:val="19"/>
+          <w:bCs w:val="0"/>
+          <w:lang w:val="he-IL" w:bidi="he-IL"/>
         </w:rPr>
         <w:t xml:space="preserve">וְזֶהוּ "דַּעַת קְדֹשִׁים" – שֶׁהוּא הַדַּעַת אוֹתוֹ יִתְבָּרַךְ, </w:t>
       </w:r>
       <w:r>
         <w:rPr>
           <w:rFonts w:ascii="Times New Roman" w:hAnsi="Times New Roman" w:eastAsia="Times New Roman" w:cs="Times New Roman"/>
-          <w:b/>
+          <w:b w:val="1"/>
           <w:sz w:val="19"/>
           <w:rtl w:val="0"/>
+          <w:szCs w:val="19"/>
+          <w:bCs w:val="1"/>
+          <w:lang w:val="en-US"/>
         </w:rPr>
         <w:t xml:space="preserve">and this is the 'knowledge of the holy ones'—the intimate awareness of Him, blessed be He, </w:t>
       </w:r>
@@ -3208,15 +3946,21 @@
           <w:b w:val="0"/>
           <w:sz w:val="19"/>
           <w:rtl w:val="1"/>
+          <w:szCs w:val="19"/>
+          <w:bCs w:val="0"/>
+          <w:lang w:val="he-IL" w:bidi="he-IL"/>
         </w:rPr>
         <w:t xml:space="preserve">שֶׁהוּא עַל יְדֵי הַתּוֹרָה שֶׁבְּעַל פֶּה. </w:t>
       </w:r>
       <w:r>
         <w:rPr>
           <w:rFonts w:ascii="Times New Roman" w:hAnsi="Times New Roman" w:eastAsia="Times New Roman" w:cs="Times New Roman"/>
-          <w:b/>
+          <w:b w:val="1"/>
           <w:sz w:val="19"/>
           <w:rtl w:val="0"/>
+          <w:szCs w:val="19"/>
+          <w:bCs w:val="1"/>
+          <w:lang w:val="en-US"/>
         </w:rPr>
         <w:t xml:space="preserve">which is attained via the Oral Torah. </w:t>
       </w:r>
@@ -3229,15 +3973,21 @@
           <w:b w:val="0"/>
           <w:sz w:val="19"/>
           <w:rtl w:val="1"/>
+          <w:szCs w:val="19"/>
+          <w:bCs w:val="0"/>
+          <w:lang w:val="he-IL" w:bidi="he-IL"/>
         </w:rPr>
         <w:t xml:space="preserve">וְדַעַת הוּא רוּחַ הַקֹּדֶשׁ, כְּמוֹ שֶׁכָּתַב רַשִׁ״י בְּפָרָשַׁת כִּי תִשָּׂא, </w:t>
       </w:r>
       <w:r>
         <w:rPr>
           <w:rFonts w:ascii="Times New Roman" w:hAnsi="Times New Roman" w:eastAsia="Times New Roman" w:cs="Times New Roman"/>
-          <w:b/>
+          <w:b w:val="1"/>
           <w:sz w:val="19"/>
           <w:rtl w:val="0"/>
+          <w:szCs w:val="19"/>
+          <w:bCs w:val="1"/>
+          <w:lang w:val="en-US"/>
         </w:rPr>
         <w:t xml:space="preserve">And Da'at (Knowledge) is the Holy Spirit, as Rashi wrote in Parashat Ki Tisa, </w:t>
       </w:r>
@@ -3270,15 +4020,21 @@
           <w:b w:val="0"/>
           <w:sz w:val="19"/>
           <w:rtl w:val="1"/>
+          <w:szCs w:val="19"/>
+          <w:bCs w:val="0"/>
+          <w:lang w:val="he-IL" w:bidi="he-IL"/>
         </w:rPr>
         <w:t xml:space="preserve">וְהוּא הַשָּׂגַת תּוֹרָה שֶׁבְּעַל פֶּה כַּנִּזְכָּר לְעֵיל; </w:t>
       </w:r>
       <w:r>
         <w:rPr>
           <w:rFonts w:ascii="Times New Roman" w:hAnsi="Times New Roman" w:eastAsia="Times New Roman" w:cs="Times New Roman"/>
-          <w:b/>
+          <w:b w:val="1"/>
           <w:sz w:val="19"/>
           <w:rtl w:val="0"/>
+          <w:szCs w:val="19"/>
+          <w:bCs w:val="1"/>
+          <w:lang w:val="en-US"/>
         </w:rPr>
         <w:t xml:space="preserve">and it is the profound perception of the Oral Torah as mentioned above; </w:t>
       </w:r>
@@ -3291,15 +4047,21 @@
           <w:b w:val="0"/>
           <w:sz w:val="19"/>
           <w:rtl w:val="1"/>
+          <w:szCs w:val="19"/>
+          <w:bCs w:val="0"/>
+          <w:lang w:val="he-IL" w:bidi="he-IL"/>
         </w:rPr>
         <w:t xml:space="preserve">וְעַל כֵּן נִקְרָא "דַּעַת קְדֹשִׁים", </w:t>
       </w:r>
       <w:r>
         <w:rPr>
           <w:rFonts w:ascii="Times New Roman" w:hAnsi="Times New Roman" w:eastAsia="Times New Roman" w:cs="Times New Roman"/>
-          <w:b/>
+          <w:b w:val="1"/>
           <w:sz w:val="19"/>
           <w:rtl w:val="0"/>
+          <w:szCs w:val="19"/>
+          <w:bCs w:val="1"/>
+          <w:lang w:val="en-US"/>
         </w:rPr>
         <w:t xml:space="preserve">and therefore it is called 'knowledge of the holy ones', </w:t>
       </w:r>
@@ -3312,15 +4074,21 @@
           <w:b w:val="0"/>
           <w:sz w:val="19"/>
           <w:rtl w:val="1"/>
+          <w:szCs w:val="19"/>
+          <w:bCs w:val="0"/>
+          <w:lang w:val="he-IL" w:bidi="he-IL"/>
         </w:rPr>
         <w:t xml:space="preserve">דִּ"קְדוֹשִׁים" הוּא שֶׁיֵּשׁ לָהֶם רוּחַ הַקֹּדֶשׁ, </w:t>
       </w:r>
       <w:r>
         <w:rPr>
           <w:rFonts w:ascii="Times New Roman" w:hAnsi="Times New Roman" w:eastAsia="Times New Roman" w:cs="Times New Roman"/>
-          <w:b/>
+          <w:b w:val="1"/>
           <w:sz w:val="19"/>
           <w:rtl w:val="0"/>
+          <w:szCs w:val="19"/>
+          <w:bCs w:val="1"/>
+          <w:lang w:val="en-US"/>
         </w:rPr>
         <w:t xml:space="preserve">for 'holy ones' are those who possess the Holy Spirit, </w:t>
       </w:r>
@@ -3333,15 +4101,21 @@
           <w:b w:val="0"/>
           <w:sz w:val="19"/>
           <w:rtl w:val="1"/>
+          <w:szCs w:val="19"/>
+          <w:bCs w:val="0"/>
+          <w:lang w:val="he-IL" w:bidi="he-IL"/>
         </w:rPr>
         <w:t xml:space="preserve">דִּקְדוּשָׁתָם מִקְּדוּשָׁתוֹ יִתְבָּרַךְ. </w:t>
       </w:r>
       <w:r>
         <w:rPr>
           <w:rFonts w:ascii="Times New Roman" w:hAnsi="Times New Roman" w:eastAsia="Times New Roman" w:cs="Times New Roman"/>
-          <w:b/>
+          <w:b w:val="1"/>
           <w:sz w:val="19"/>
           <w:rtl w:val="0"/>
+          <w:szCs w:val="19"/>
+          <w:bCs w:val="1"/>
+          <w:lang w:val="en-US"/>
         </w:rPr>
         <w:t xml:space="preserve">their holiness emanating directly from His holiness. </w:t>
       </w:r>
@@ -3354,15 +4128,21 @@
           <w:b w:val="0"/>
           <w:sz w:val="19"/>
           <w:rtl w:val="1"/>
+          <w:szCs w:val="19"/>
+          <w:bCs w:val="0"/>
+          <w:lang w:val="he-IL" w:bidi="he-IL"/>
         </w:rPr>
         <w:t xml:space="preserve">וְיִשְׂרָאֵל נִבְחֲרוּ לִהְיוֹת כּוּלָּם כֵּן, </w:t>
       </w:r>
       <w:r>
         <w:rPr>
           <w:rFonts w:ascii="Times New Roman" w:hAnsi="Times New Roman" w:eastAsia="Times New Roman" w:cs="Times New Roman"/>
-          <w:b/>
+          <w:b w:val="1"/>
           <w:sz w:val="19"/>
           <w:rtl w:val="0"/>
+          <w:szCs w:val="19"/>
+          <w:bCs w:val="1"/>
+          <w:lang w:val="en-US"/>
         </w:rPr>
         <w:t xml:space="preserve">And Israel were chosen so that all of them would be on this level, </w:t>
       </w:r>
@@ -3375,15 +4155,21 @@
           <w:b w:val="0"/>
           <w:sz w:val="19"/>
           <w:rtl w:val="1"/>
+          <w:szCs w:val="19"/>
+          <w:bCs w:val="0"/>
+          <w:lang w:val="he-IL" w:bidi="he-IL"/>
         </w:rPr>
         <w:t xml:space="preserve">וּכְמוֹ שֶׁכָּתוּב: "כִּי עַם קָדוֹשׁ אַתָּה", </w:t>
       </w:r>
       <w:r>
         <w:rPr>
           <w:rFonts w:ascii="Times New Roman" w:hAnsi="Times New Roman" w:eastAsia="Times New Roman" w:cs="Times New Roman"/>
-          <w:b/>
+          <w:b w:val="1"/>
           <w:sz w:val="19"/>
           <w:rtl w:val="0"/>
+          <w:szCs w:val="19"/>
+          <w:bCs w:val="1"/>
+          <w:lang w:val="en-US"/>
         </w:rPr>
         <w:t xml:space="preserve">and as it is written: 'For a holy people are you,' </w:t>
       </w:r>
@@ -3411,15 +4197,21 @@
           <w:b w:val="0"/>
           <w:sz w:val="19"/>
           <w:rtl w:val="1"/>
+          <w:szCs w:val="19"/>
+          <w:bCs w:val="0"/>
+          <w:lang w:val="he-IL" w:bidi="he-IL"/>
         </w:rPr>
         <w:t xml:space="preserve">וְנֶאֱמַר: "קֹדֶשׁ יִשְׂרָאֵל לַה'", </w:t>
       </w:r>
       <w:r>
         <w:rPr>
           <w:rFonts w:ascii="Times New Roman" w:hAnsi="Times New Roman" w:eastAsia="Times New Roman" w:cs="Times New Roman"/>
-          <w:b/>
+          <w:b w:val="1"/>
           <w:sz w:val="19"/>
           <w:rtl w:val="0"/>
+          <w:szCs w:val="19"/>
+          <w:bCs w:val="1"/>
+          <w:lang w:val="en-US"/>
         </w:rPr>
         <w:t xml:space="preserve">and it is said: 'Israel is holy unto Hashem,' </w:t>
       </w:r>
@@ -3447,15 +4239,21 @@
           <w:b w:val="0"/>
           <w:sz w:val="19"/>
           <w:rtl w:val="1"/>
+          <w:szCs w:val="19"/>
+          <w:bCs w:val="0"/>
+          <w:lang w:val="he-IL" w:bidi="he-IL"/>
         </w:rPr>
         <w:t xml:space="preserve">וְנֶאֱמַר: "קְדֹשִׁים תִּהְיוּ", "וִהְיִיתֶם קְדֹשִׁים". </w:t>
       </w:r>
       <w:r>
         <w:rPr>
           <w:rFonts w:ascii="Times New Roman" w:hAnsi="Times New Roman" w:eastAsia="Times New Roman" w:cs="Times New Roman"/>
-          <w:b/>
+          <w:b w:val="1"/>
           <w:sz w:val="19"/>
           <w:rtl w:val="0"/>
+          <w:szCs w:val="19"/>
+          <w:bCs w:val="1"/>
+          <w:lang w:val="en-US"/>
         </w:rPr>
         <w:t xml:space="preserve">and said: 'You shall be holy,' 'and you shall be holy.' </w:t>
       </w:r>
@@ -3483,15 +4281,21 @@
           <w:b w:val="0"/>
           <w:sz w:val="19"/>
           <w:rtl w:val="1"/>
+          <w:szCs w:val="19"/>
+          <w:bCs w:val="0"/>
+          <w:lang w:val="he-IL" w:bidi="he-IL"/>
         </w:rPr>
         <w:t xml:space="preserve">וְכֵן נִקְרְאוּ בַּגְּמָרָא בְּפֶרֶק רַבִּי עֲקִיבָא וּבְפֶרֶק קַמָּא דְּחֻלִּין: </w:t>
       </w:r>
       <w:r>
         <w:rPr>
           <w:rFonts w:ascii="Times New Roman" w:hAnsi="Times New Roman" w:eastAsia="Times New Roman" w:cs="Times New Roman"/>
-          <w:b/>
+          <w:b w:val="1"/>
           <w:sz w:val="19"/>
           <w:rtl w:val="0"/>
+          <w:szCs w:val="19"/>
+          <w:bCs w:val="1"/>
+          <w:lang w:val="en-US"/>
         </w:rPr>
         <w:t xml:space="preserve">And so they are termed in the Gemara in the chapter 'Rabbi Akiva' and in the first chapter of Chullin: </w:t>
       </w:r>
@@ -3519,15 +4323,21 @@
           <w:b w:val="0"/>
           <w:sz w:val="19"/>
           <w:rtl w:val="1"/>
+          <w:szCs w:val="19"/>
+          <w:bCs w:val="0"/>
+          <w:lang w:val="he-IL" w:bidi="he-IL"/>
         </w:rPr>
         <w:t xml:space="preserve">"יִשְׂרָאֵל קְדוֹשִׁים". </w:t>
       </w:r>
       <w:r>
         <w:rPr>
           <w:rFonts w:ascii="Times New Roman" w:hAnsi="Times New Roman" w:eastAsia="Times New Roman" w:cs="Times New Roman"/>
-          <w:b/>
+          <w:b w:val="1"/>
           <w:sz w:val="19"/>
           <w:rtl w:val="0"/>
+          <w:szCs w:val="19"/>
+          <w:bCs w:val="1"/>
+          <w:lang w:val="en-US"/>
         </w:rPr>
         <w:t xml:space="preserve">'Israel are holy.' </w:t>
       </w:r>
@@ -3569,15 +4379,21 @@
           <w:b w:val="0"/>
           <w:sz w:val="19"/>
           <w:rtl w:val="1"/>
+          <w:szCs w:val="19"/>
+          <w:bCs w:val="0"/>
+          <w:lang w:val="he-IL" w:bidi="he-IL"/>
         </w:rPr>
         <w:t xml:space="preserve">וְעַל זֶה הָיָה מַתַּן תּוֹרָה, </w:t>
       </w:r>
       <w:r>
         <w:rPr>
           <w:rFonts w:ascii="Times New Roman" w:hAnsi="Times New Roman" w:eastAsia="Times New Roman" w:cs="Times New Roman"/>
-          <w:b/>
+          <w:b w:val="1"/>
           <w:sz w:val="19"/>
           <w:rtl w:val="0"/>
+          <w:szCs w:val="19"/>
+          <w:bCs w:val="1"/>
+          <w:lang w:val="en-US"/>
         </w:rPr>
         <w:t xml:space="preserve">And for this purpose the Giving of the Torah took place, </w:t>
       </w:r>
@@ -3590,15 +4406,21 @@
           <w:b w:val="0"/>
           <w:sz w:val="19"/>
           <w:rtl w:val="1"/>
+          <w:szCs w:val="19"/>
+          <w:bCs w:val="0"/>
+          <w:lang w:val="he-IL" w:bidi="he-IL"/>
         </w:rPr>
         <w:t xml:space="preserve">כְּמוֹ שֶׁנֶּאֱמַר: "וְאַתֶּם תִּהְיוּ לִי מַמְלֶכֶת כֹּהֲנִים וְגוֹי קָדוֹשׁ". </w:t>
       </w:r>
       <w:r>
         <w:rPr>
           <w:rFonts w:ascii="Times New Roman" w:hAnsi="Times New Roman" w:eastAsia="Times New Roman" w:cs="Times New Roman"/>
-          <w:b/>
+          <w:b w:val="1"/>
           <w:sz w:val="19"/>
           <w:rtl w:val="0"/>
+          <w:szCs w:val="19"/>
+          <w:bCs w:val="1"/>
+          <w:lang w:val="en-US"/>
         </w:rPr>
         <w:t xml:space="preserve">as it is said: 'And you shall be unto Me a kingdom of priests and a holy nation.' </w:t>
       </w:r>
@@ -3626,15 +4448,21 @@
           <w:b w:val="0"/>
           <w:sz w:val="19"/>
           <w:rtl w:val="1"/>
+          <w:szCs w:val="19"/>
+          <w:bCs w:val="0"/>
+          <w:lang w:val="he-IL" w:bidi="he-IL"/>
         </w:rPr>
         <w:t xml:space="preserve">וְכֹהֲנִים הֵם הַקְּדוֹשִׁים, </w:t>
       </w:r>
       <w:r>
         <w:rPr>
           <w:rFonts w:ascii="Times New Roman" w:hAnsi="Times New Roman" w:eastAsia="Times New Roman" w:cs="Times New Roman"/>
-          <w:b/>
+          <w:b w:val="1"/>
           <w:sz w:val="19"/>
           <w:rtl w:val="0"/>
+          <w:szCs w:val="19"/>
+          <w:bCs w:val="1"/>
+          <w:lang w:val="en-US"/>
         </w:rPr>
         <w:t xml:space="preserve">And the priests are the dedicated holy ones, </w:t>
       </w:r>
@@ -3647,15 +4475,21 @@
           <w:b w:val="0"/>
           <w:sz w:val="19"/>
           <w:rtl w:val="1"/>
+          <w:szCs w:val="19"/>
+          <w:bCs w:val="0"/>
+          <w:lang w:val="he-IL" w:bidi="he-IL"/>
         </w:rPr>
         <w:t xml:space="preserve">כְּמוֹ שֶׁנֶּאֱמַר בְּרֵישׁ פָּרָשַׁת אֱמוֹר: "קְדֹשִׁים יִהְיוּ" וְגוֹמֵר, </w:t>
       </w:r>
       <w:r>
         <w:rPr>
           <w:rFonts w:ascii="Times New Roman" w:hAnsi="Times New Roman" w:eastAsia="Times New Roman" w:cs="Times New Roman"/>
-          <w:b/>
+          <w:b w:val="1"/>
           <w:sz w:val="19"/>
           <w:rtl w:val="0"/>
+          <w:szCs w:val="19"/>
+          <w:bCs w:val="1"/>
+          <w:lang w:val="en-US"/>
         </w:rPr>
         <w:t xml:space="preserve">as is said at the beginning of Parashat Emor: 'They shall be holy, etc.', </w:t>
       </w:r>
@@ -3668,17 +4502,23 @@
           <w:b w:val="0"/>
           <w:sz w:val="19"/>
           <w:rtl w:val="1"/>
-        </w:rPr>
-        <w:t xml:space="preserve">"קָדֹשׁ יִהְיֶה לָּךְ" וְגוֹמֵר "כִּי אֲנִי ה' מְקַדִּשְׁכֶם", </w:t>
-      </w:r>
-      <w:r>
-        <w:rPr>
-          <w:rFonts w:ascii="Times New Roman" w:hAnsi="Times New Roman" w:eastAsia="Times New Roman" w:cs="Times New Roman"/>
-          <w:b/>
+          <w:szCs w:val="19"/>
+          <w:bCs w:val="0"/>
+          <w:lang w:val="he-IL" w:bidi="he-IL"/>
+        </w:rPr>
+        <w:t xml:space="preserve">"קָדֹשׁ יִהְיֶה לָּךְ" וְגוֹמֵר "כִּי אֲנִי הַשֵּׁם מְקַדְּשׁוֹ", </w:t>
+      </w:r>
+      <w:r>
+        <w:rPr>
+          <w:rFonts w:ascii="Times New Roman" w:hAnsi="Times New Roman" w:eastAsia="Times New Roman" w:cs="Times New Roman"/>
+          <w:b w:val="1"/>
           <w:sz w:val="19"/>
           <w:rtl w:val="0"/>
-        </w:rPr>
-        <w:t xml:space="preserve">'He shall be holy unto you... for I Hashem sanctify you,' </w:t>
+          <w:szCs w:val="19"/>
+          <w:bCs w:val="1"/>
+          <w:lang w:val="en-US"/>
+        </w:rPr>
+        <w:t xml:space="preserve">‘He shall be holy unto you,’ etc., ‘for I, Hashem, sanctify him,’ </w:t>
       </w:r>
       <w:r>
         <w:t xml:space="preserve">  </w:t>
@@ -3689,15 +4529,21 @@
           <w:b w:val="0"/>
           <w:sz w:val="19"/>
           <w:rtl w:val="1"/>
-        </w:rPr>
-        <w:t xml:space="preserve">וּבְפָרָשַׁת קֹרַח: "אֲשֶׁר יִבְחַר ה' הוּא הַקָּדוֹשׁ". </w:t>
-      </w:r>
-      <w:r>
-        <w:rPr>
-          <w:rFonts w:ascii="Times New Roman" w:hAnsi="Times New Roman" w:eastAsia="Times New Roman" w:cs="Times New Roman"/>
-          <w:b/>
+          <w:szCs w:val="19"/>
+          <w:bCs w:val="0"/>
+          <w:lang w:val="he-IL" w:bidi="he-IL"/>
+        </w:rPr>
+        <w:t xml:space="preserve">וּבְפָרָשַׁת קֹרַח: "אֲשֶׁר יִבְחַר הַשֵּׁם הוּא הַקָּדוֹשׁ". </w:t>
+      </w:r>
+      <w:r>
+        <w:rPr>
+          <w:rFonts w:ascii="Times New Roman" w:hAnsi="Times New Roman" w:eastAsia="Times New Roman" w:cs="Times New Roman"/>
+          <w:b w:val="1"/>
           <w:sz w:val="19"/>
           <w:rtl w:val="0"/>
+          <w:szCs w:val="19"/>
+          <w:bCs w:val="1"/>
+          <w:lang w:val="en-US"/>
         </w:rPr>
         <w:t xml:space="preserve">and in Parashat Korach: 'the one whom Hashem chooses is the holy one.' </w:t>
       </w:r>
@@ -3710,15 +4556,21 @@
           <w:b w:val="0"/>
           <w:sz w:val="19"/>
           <w:rtl w:val="1"/>
-        </w:rPr>
-        <w:t xml:space="preserve">וְהֵם אָמְרוּ: "כָּל הָעֵדָה כֻּלָּם קְדֹשִׁים וּבְתוֹכָם ה'", </w:t>
-      </w:r>
-      <w:r>
-        <w:rPr>
-          <w:rFonts w:ascii="Times New Roman" w:hAnsi="Times New Roman" w:eastAsia="Times New Roman" w:cs="Times New Roman"/>
-          <w:b/>
+          <w:szCs w:val="19"/>
+          <w:bCs w:val="0"/>
+          <w:lang w:val="he-IL" w:bidi="he-IL"/>
+        </w:rPr>
+        <w:t xml:space="preserve">וְהֵם אָמְרוּ: "כָּל הָעֵדָה כֻּלָּם קְדֹשִׁים וּבְתוֹכָם הַשֵּׁם", </w:t>
+      </w:r>
+      <w:r>
+        <w:rPr>
+          <w:rFonts w:ascii="Times New Roman" w:hAnsi="Times New Roman" w:eastAsia="Times New Roman" w:cs="Times New Roman"/>
+          <w:b w:val="1"/>
           <w:sz w:val="19"/>
           <w:rtl w:val="0"/>
+          <w:szCs w:val="19"/>
+          <w:bCs w:val="1"/>
+          <w:lang w:val="en-US"/>
         </w:rPr>
         <w:t xml:space="preserve">And Korach's assembly claimed: 'For all the congregation are holy, and Hashem is among them,' </w:t>
       </w:r>
@@ -3731,15 +4583,21 @@
           <w:b w:val="0"/>
           <w:sz w:val="19"/>
           <w:rtl w:val="1"/>
+          <w:szCs w:val="19"/>
+          <w:bCs w:val="0"/>
+          <w:lang w:val="he-IL" w:bidi="he-IL"/>
         </w:rPr>
         <w:t xml:space="preserve">דְּזֶהוּ הַקְּדוּשָּׁה כְּשֶׁהַשֵּׁם יִתְבָּרַךְ שׁוֹכֵן בְּתוֹכָם, </w:t>
       </w:r>
       <w:r>
         <w:rPr>
           <w:rFonts w:ascii="Times New Roman" w:hAnsi="Times New Roman" w:eastAsia="Times New Roman" w:cs="Times New Roman"/>
-          <w:b/>
+          <w:b w:val="1"/>
           <w:sz w:val="19"/>
           <w:rtl w:val="0"/>
+          <w:szCs w:val="19"/>
+          <w:bCs w:val="1"/>
+          <w:lang w:val="en-US"/>
         </w:rPr>
         <w:t xml:space="preserve">for this is genuine holiness—when Hashem dwells among them, </w:t>
       </w:r>
@@ -3752,15 +4610,21 @@
           <w:b w:val="0"/>
           <w:sz w:val="19"/>
           <w:rtl w:val="1"/>
+          <w:szCs w:val="19"/>
+          <w:bCs w:val="0"/>
+          <w:lang w:val="he-IL" w:bidi="he-IL"/>
         </w:rPr>
         <w:t xml:space="preserve">וְהָאֱמֶת כֵּן. </w:t>
       </w:r>
       <w:r>
         <w:rPr>
           <w:rFonts w:ascii="Times New Roman" w:hAnsi="Times New Roman" w:eastAsia="Times New Roman" w:cs="Times New Roman"/>
-          <w:b/>
+          <w:b w:val="1"/>
           <w:sz w:val="19"/>
           <w:rtl w:val="0"/>
+          <w:szCs w:val="19"/>
+          <w:bCs w:val="1"/>
+          <w:lang w:val="en-US"/>
         </w:rPr>
         <w:t xml:space="preserve">and in ultimate truth it is so. </w:t>
       </w:r>
@@ -3773,15 +4637,21 @@
           <w:b w:val="0"/>
           <w:sz w:val="19"/>
           <w:rtl w:val="1"/>
+          <w:szCs w:val="19"/>
+          <w:bCs w:val="0"/>
+          <w:lang w:val="he-IL" w:bidi="he-IL"/>
         </w:rPr>
         <w:t xml:space="preserve">וְלֶעָתִיד יִהְיֶה לְגַמְרֵי כֵּן, </w:t>
       </w:r>
       <w:r>
         <w:rPr>
           <w:rFonts w:ascii="Times New Roman" w:hAnsi="Times New Roman" w:eastAsia="Times New Roman" w:cs="Times New Roman"/>
-          <w:b/>
+          <w:b w:val="1"/>
           <w:sz w:val="19"/>
           <w:rtl w:val="0"/>
+          <w:szCs w:val="19"/>
+          <w:bCs w:val="1"/>
+          <w:lang w:val="en-US"/>
         </w:rPr>
         <w:t xml:space="preserve">And in the ultimate future it will be fully realized, </w:t>
       </w:r>
@@ -3794,15 +4664,21 @@
           <w:b w:val="0"/>
           <w:sz w:val="19"/>
           <w:rtl w:val="1"/>
+          <w:szCs w:val="19"/>
+          <w:bCs w:val="0"/>
+          <w:lang w:val="he-IL" w:bidi="he-IL"/>
         </w:rPr>
         <w:t xml:space="preserve">וְיִהְיֶה מַמְלֶכֶת כֹּהֲנִים, </w:t>
       </w:r>
       <w:r>
         <w:rPr>
           <w:rFonts w:ascii="Times New Roman" w:hAnsi="Times New Roman" w:eastAsia="Times New Roman" w:cs="Times New Roman"/>
-          <w:b/>
+          <w:b w:val="1"/>
           <w:sz w:val="19"/>
           <w:rtl w:val="0"/>
+          <w:szCs w:val="19"/>
+          <w:bCs w:val="1"/>
+          <w:lang w:val="en-US"/>
         </w:rPr>
         <w:t xml:space="preserve">and all will be a kingdom of priests, </w:t>
       </w:r>
@@ -3815,15 +4691,21 @@
           <w:b w:val="0"/>
           <w:sz w:val="19"/>
           <w:rtl w:val="1"/>
+          <w:szCs w:val="19"/>
+          <w:bCs w:val="0"/>
+          <w:lang w:val="he-IL" w:bidi="he-IL"/>
         </w:rPr>
         <w:t xml:space="preserve">וְ"שִׂפְתֵי כֹהֵן יִשְׁמְרוּ דַעַת", </w:t>
       </w:r>
       <w:r>
         <w:rPr>
           <w:rFonts w:ascii="Times New Roman" w:hAnsi="Times New Roman" w:eastAsia="Times New Roman" w:cs="Times New Roman"/>
-          <w:b/>
+          <w:b w:val="1"/>
           <w:sz w:val="19"/>
           <w:rtl w:val="0"/>
+          <w:szCs w:val="19"/>
+          <w:bCs w:val="1"/>
+          <w:lang w:val="en-US"/>
         </w:rPr>
         <w:t xml:space="preserve">and 'the priest's lips shall keep knowledge,' </w:t>
       </w:r>
@@ -3841,15 +4723,21 @@
           <w:b w:val="0"/>
           <w:sz w:val="19"/>
           <w:rtl w:val="1"/>
+          <w:szCs w:val="19"/>
+          <w:bCs w:val="0"/>
+          <w:lang w:val="he-IL" w:bidi="he-IL"/>
         </w:rPr>
         <w:t xml:space="preserve">וְאָז "כוּלָּם יֵדְעוּ" וְגוֹמֵר. </w:t>
       </w:r>
       <w:r>
         <w:rPr>
           <w:rFonts w:ascii="Times New Roman" w:hAnsi="Times New Roman" w:eastAsia="Times New Roman" w:cs="Times New Roman"/>
-          <w:b/>
+          <w:b w:val="1"/>
           <w:sz w:val="19"/>
           <w:rtl w:val="0"/>
+          <w:szCs w:val="19"/>
+          <w:bCs w:val="1"/>
+          <w:lang w:val="en-US"/>
         </w:rPr>
         <w:t xml:space="preserve">and then 'all of them shall know Me, etc.' </w:t>
       </w:r>
@@ -3862,15 +4750,21 @@
           <w:b w:val="0"/>
           <w:sz w:val="19"/>
           <w:rtl w:val="1"/>
+          <w:szCs w:val="19"/>
+          <w:bCs w:val="0"/>
+          <w:lang w:val="he-IL" w:bidi="he-IL"/>
         </w:rPr>
         <w:t xml:space="preserve">וּבְמַעֲמַד הַר סִינַי הָיוּ כוּלָּם כֵּן, </w:t>
       </w:r>
       <w:r>
         <w:rPr>
           <w:rFonts w:ascii="Times New Roman" w:hAnsi="Times New Roman" w:eastAsia="Times New Roman" w:cs="Times New Roman"/>
-          <w:b/>
+          <w:b w:val="1"/>
           <w:sz w:val="19"/>
           <w:rtl w:val="0"/>
+          <w:szCs w:val="19"/>
+          <w:bCs w:val="1"/>
+          <w:lang w:val="en-US"/>
         </w:rPr>
         <w:t xml:space="preserve">And at the Revelation at Mount Sinai all of them were on this level, </w:t>
       </w:r>
@@ -3883,15 +4777,21 @@
           <w:b w:val="0"/>
           <w:sz w:val="19"/>
           <w:rtl w:val="1"/>
+          <w:szCs w:val="19"/>
+          <w:bCs w:val="0"/>
+          <w:lang w:val="he-IL" w:bidi="he-IL"/>
         </w:rPr>
         <w:t xml:space="preserve">וּכְמוֹ שֶׁנֶּאֱמַר בְּשִׁיר הַשִּׁירִים רַבָּה עַל פָּסוּק "יִשָּׁקֵנִי"; </w:t>
       </w:r>
       <w:r>
         <w:rPr>
           <w:rFonts w:ascii="Times New Roman" w:hAnsi="Times New Roman" w:eastAsia="Times New Roman" w:cs="Times New Roman"/>
-          <w:b/>
+          <w:b w:val="1"/>
           <w:sz w:val="19"/>
           <w:rtl w:val="0"/>
+          <w:szCs w:val="19"/>
+          <w:bCs w:val="1"/>
+          <w:lang w:val="en-US"/>
         </w:rPr>
         <w:t xml:space="preserve">as stated in Shir HaShirim Rabbah on the verse 'Let him kiss me'; </w:t>
       </w:r>
@@ -3904,15 +4804,21 @@
           <w:b w:val="0"/>
           <w:sz w:val="19"/>
           <w:rtl w:val="1"/>
+          <w:szCs w:val="19"/>
+          <w:bCs w:val="0"/>
+          <w:lang w:val="he-IL" w:bidi="he-IL"/>
         </w:rPr>
         <w:t xml:space="preserve">אֲבָל אַחַר כָּךְ, אַף דְּיֵשׁ קְדוּשָׁה בְּכָל יִשְׂרָאֵל, </w:t>
       </w:r>
       <w:r>
         <w:rPr>
           <w:rFonts w:ascii="Times New Roman" w:hAnsi="Times New Roman" w:eastAsia="Times New Roman" w:cs="Times New Roman"/>
-          <w:b/>
+          <w:b w:val="1"/>
           <w:sz w:val="19"/>
           <w:rtl w:val="0"/>
+          <w:szCs w:val="19"/>
+          <w:bCs w:val="1"/>
+          <w:lang w:val="en-US"/>
         </w:rPr>
         <w:t xml:space="preserve">yet afterward, even though holiness permeates all Israel, </w:t>
       </w:r>
@@ -3925,15 +4831,21 @@
           <w:b w:val="0"/>
           <w:sz w:val="19"/>
           <w:rtl w:val="1"/>
+          <w:szCs w:val="19"/>
+          <w:bCs w:val="0"/>
+          <w:lang w:val="he-IL" w:bidi="he-IL"/>
         </w:rPr>
         <w:t xml:space="preserve">מִכָּל מָקוֹם יֵשׁ מַדְרֵיגוֹת, </w:t>
       </w:r>
       <w:r>
         <w:rPr>
           <w:rFonts w:ascii="Times New Roman" w:hAnsi="Times New Roman" w:eastAsia="Times New Roman" w:cs="Times New Roman"/>
-          <w:b/>
+          <w:b w:val="1"/>
           <w:sz w:val="19"/>
           <w:rtl w:val="0"/>
+          <w:szCs w:val="19"/>
+          <w:bCs w:val="1"/>
+          <w:lang w:val="en-US"/>
         </w:rPr>
         <w:t xml:space="preserve">nevertheless gradations exist, </w:t>
       </w:r>
@@ -3946,15 +4858,21 @@
           <w:b w:val="0"/>
           <w:sz w:val="19"/>
           <w:rtl w:val="1"/>
+          <w:szCs w:val="19"/>
+          <w:bCs w:val="0"/>
+          <w:lang w:val="he-IL" w:bidi="he-IL"/>
         </w:rPr>
         <w:t xml:space="preserve">וְהָיוּ צְרִיכִין לְקַבֵּל מִמֹּשֶׁה וּמֵאַהֲרֹן, </w:t>
       </w:r>
       <w:r>
         <w:rPr>
           <w:rFonts w:ascii="Times New Roman" w:hAnsi="Times New Roman" w:eastAsia="Times New Roman" w:cs="Times New Roman"/>
-          <w:b/>
+          <w:b w:val="1"/>
           <w:sz w:val="19"/>
           <w:rtl w:val="0"/>
+          <w:szCs w:val="19"/>
+          <w:bCs w:val="1"/>
+          <w:lang w:val="en-US"/>
         </w:rPr>
         <w:t xml:space="preserve">and they needed to receive the transmission from Moses and Aaron, </w:t>
       </w:r>
@@ -3967,15 +4885,21 @@
           <w:b w:val="0"/>
           <w:sz w:val="19"/>
           <w:rtl w:val="1"/>
+          <w:szCs w:val="19"/>
+          <w:bCs w:val="0"/>
+          <w:lang w:val="he-IL" w:bidi="he-IL"/>
         </w:rPr>
         <w:t xml:space="preserve">כְּמוֹ שֶׁנֶּאֱמַר (בְּעֵירוּבִין נד:): </w:t>
       </w:r>
       <w:r>
         <w:rPr>
           <w:rFonts w:ascii="Times New Roman" w:hAnsi="Times New Roman" w:eastAsia="Times New Roman" w:cs="Times New Roman"/>
-          <w:b/>
+          <w:b w:val="1"/>
           <w:sz w:val="19"/>
           <w:rtl w:val="0"/>
+          <w:szCs w:val="19"/>
+          <w:bCs w:val="1"/>
+          <w:lang w:val="en-US"/>
         </w:rPr>
         <w:t xml:space="preserve">as stated (in Eruvin 54b): </w:t>
       </w:r>
@@ -4003,15 +4927,21 @@
           <w:b w:val="0"/>
           <w:sz w:val="19"/>
           <w:rtl w:val="1"/>
+          <w:szCs w:val="19"/>
+          <w:bCs w:val="0"/>
+          <w:lang w:val="he-IL" w:bidi="he-IL"/>
         </w:rPr>
         <w:t xml:space="preserve">"כֵּיצַד סֵדֶר מִשְׁנָה" וְכוּלֵי. </w:t>
       </w:r>
       <w:r>
         <w:rPr>
           <w:rFonts w:ascii="Times New Roman" w:hAnsi="Times New Roman" w:eastAsia="Times New Roman" w:cs="Times New Roman"/>
-          <w:b/>
+          <w:b w:val="1"/>
           <w:sz w:val="19"/>
           <w:rtl w:val="0"/>
+          <w:szCs w:val="19"/>
+          <w:bCs w:val="1"/>
+          <w:lang w:val="en-US"/>
         </w:rPr>
         <w:t xml:space="preserve">'How was the order of the teaching of the Mishnah, etc.' </w:t>
       </w:r>
@@ -4024,15 +4954,21 @@
           <w:b w:val="0"/>
           <w:sz w:val="19"/>
           <w:rtl w:val="1"/>
+          <w:szCs w:val="19"/>
+          <w:bCs w:val="0"/>
+          <w:lang w:val="he-IL" w:bidi="he-IL"/>
         </w:rPr>
         <w:t xml:space="preserve">וְעַל זֶה אָמַר (בִּשְׁמוֹת רַבָּה פָּרָשָׁה טו): </w:t>
       </w:r>
       <w:r>
         <w:rPr>
           <w:rFonts w:ascii="Times New Roman" w:hAnsi="Times New Roman" w:eastAsia="Times New Roman" w:cs="Times New Roman"/>
-          <w:b/>
+          <w:b w:val="1"/>
           <w:sz w:val="19"/>
           <w:rtl w:val="0"/>
+          <w:szCs w:val="19"/>
+          <w:bCs w:val="1"/>
+          <w:lang w:val="en-US"/>
         </w:rPr>
         <w:t xml:space="preserve">And on this it is said (in Shemot Rabbah, Parashah 15): </w:t>
       </w:r>
@@ -4045,15 +4981,21 @@
           <w:b w:val="0"/>
           <w:sz w:val="19"/>
           <w:rtl w:val="1"/>
+          <w:szCs w:val="19"/>
+          <w:bCs w:val="0"/>
+          <w:lang w:val="he-IL" w:bidi="he-IL"/>
         </w:rPr>
         <w:t xml:space="preserve">"'שְׁלַח אוֹרְךָ וַאֲמִתְּךָ' וְגוֹמֵר – </w:t>
       </w:r>
       <w:r>
         <w:rPr>
           <w:rFonts w:ascii="Times New Roman" w:hAnsi="Times New Roman" w:eastAsia="Times New Roman" w:cs="Times New Roman"/>
-          <w:b/>
+          <w:b w:val="1"/>
           <w:sz w:val="19"/>
           <w:rtl w:val="0"/>
+          <w:szCs w:val="19"/>
+          <w:bCs w:val="1"/>
+          <w:lang w:val="en-US"/>
         </w:rPr>
         <w:t xml:space="preserve">'Send Your light and Your truth, etc.'— </w:t>
       </w:r>
@@ -4066,15 +5008,21 @@
           <w:b w:val="0"/>
           <w:sz w:val="19"/>
           <w:rtl w:val="1"/>
+          <w:szCs w:val="19"/>
+          <w:bCs w:val="0"/>
+          <w:lang w:val="he-IL" w:bidi="he-IL"/>
         </w:rPr>
         <w:t xml:space="preserve">הֵם מֹשֶׁה וְאַהֲרֹן, </w:t>
       </w:r>
       <w:r>
         <w:rPr>
           <w:rFonts w:ascii="Times New Roman" w:hAnsi="Times New Roman" w:eastAsia="Times New Roman" w:cs="Times New Roman"/>
-          <w:b/>
+          <w:b w:val="1"/>
           <w:sz w:val="19"/>
           <w:rtl w:val="0"/>
+          <w:szCs w:val="19"/>
+          <w:bCs w:val="1"/>
+          <w:lang w:val="en-US"/>
         </w:rPr>
         <w:t xml:space="preserve">these are Moses and Aaron, </w:t>
       </w:r>
@@ -4087,15 +5035,21 @@
           <w:b w:val="0"/>
           <w:sz w:val="19"/>
           <w:rtl w:val="1"/>
+          <w:szCs w:val="19"/>
+          <w:bCs w:val="0"/>
+          <w:lang w:val="he-IL" w:bidi="he-IL"/>
         </w:rPr>
         <w:t xml:space="preserve">כְּמוֹ שֶׁכָּתוּב: 'תֻּמֶּיךָ וְאוּרֶיךָ' וְגוֹמֵר, </w:t>
       </w:r>
       <w:r>
         <w:rPr>
           <w:rFonts w:ascii="Times New Roman" w:hAnsi="Times New Roman" w:eastAsia="Times New Roman" w:cs="Times New Roman"/>
-          <w:b/>
+          <w:b w:val="1"/>
           <w:sz w:val="19"/>
           <w:rtl w:val="0"/>
+          <w:szCs w:val="19"/>
+          <w:bCs w:val="1"/>
+          <w:lang w:val="en-US"/>
         </w:rPr>
         <w:t xml:space="preserve">as it is written: 'Your Thummim and Your Urim, etc.', </w:t>
       </w:r>
@@ -4113,15 +5067,21 @@
           <w:b w:val="0"/>
           <w:sz w:val="19"/>
           <w:rtl w:val="1"/>
+          <w:szCs w:val="19"/>
+          <w:bCs w:val="0"/>
+          <w:lang w:val="he-IL" w:bidi="he-IL"/>
         </w:rPr>
         <w:t xml:space="preserve">וְנֶאֱמַר: 'תּוֹרַת אֱמֶת' וְגוֹמֵר; </w:t>
       </w:r>
       <w:r>
         <w:rPr>
           <w:rFonts w:ascii="Times New Roman" w:hAnsi="Times New Roman" w:eastAsia="Times New Roman" w:cs="Times New Roman"/>
-          <w:b/>
+          <w:b w:val="1"/>
           <w:sz w:val="19"/>
           <w:rtl w:val="0"/>
+          <w:szCs w:val="19"/>
+          <w:bCs w:val="1"/>
+          <w:lang w:val="en-US"/>
         </w:rPr>
         <w:t xml:space="preserve">and said: 'The law of truth was in his mouth, etc.'; </w:t>
       </w:r>
@@ -4149,15 +5109,21 @@
           <w:b w:val="0"/>
           <w:sz w:val="19"/>
           <w:rtl w:val="1"/>
+          <w:szCs w:val="19"/>
+          <w:bCs w:val="0"/>
+          <w:lang w:val="he-IL" w:bidi="he-IL"/>
         </w:rPr>
         <w:t xml:space="preserve">וְאָמַר: 'הַחֹדֶשׁ הַזֶּה לָכֶם' – זֶה שֶׁנֶּאֱמַר" וְכוּלֵי, עַיֵּין שָׁם. </w:t>
       </w:r>
       <w:r>
         <w:rPr>
           <w:rFonts w:ascii="Times New Roman" w:hAnsi="Times New Roman" w:eastAsia="Times New Roman" w:cs="Times New Roman"/>
-          <w:b/>
+          <w:b w:val="1"/>
           <w:sz w:val="19"/>
           <w:rtl w:val="0"/>
+          <w:szCs w:val="19"/>
+          <w:bCs w:val="1"/>
+          <w:lang w:val="en-US"/>
         </w:rPr>
         <w:t xml:space="preserve">and it says: 'This month shall be unto you'—this is what Scripture states, etc., see there. </w:t>
       </w:r>
@@ -4170,15 +5136,21 @@
           <w:b w:val="0"/>
           <w:sz w:val="19"/>
           <w:rtl w:val="1"/>
+          <w:szCs w:val="19"/>
+          <w:bCs w:val="0"/>
+          <w:lang w:val="he-IL" w:bidi="he-IL"/>
         </w:rPr>
         <w:t xml:space="preserve">וּרְצוֹנוֹ לוֹמַר דְּזֶהוּ עִנְיַן קִדּוּשׁ הַחֹדֶשׁ שֶׁנִּמְסַר לָהֶם, </w:t>
       </w:r>
       <w:r>
         <w:rPr>
           <w:rFonts w:ascii="Times New Roman" w:hAnsi="Times New Roman" w:eastAsia="Times New Roman" w:cs="Times New Roman"/>
-          <w:b/>
+          <w:b w:val="1"/>
           <w:sz w:val="19"/>
           <w:rtl w:val="0"/>
+          <w:szCs w:val="19"/>
+          <w:bCs w:val="1"/>
+          <w:lang w:val="en-US"/>
         </w:rPr>
         <w:t xml:space="preserve">And this means that this is the essence of the New Moon's sanctification delivered to them, </w:t>
       </w:r>
@@ -4191,15 +5163,21 @@
           <w:b w:val="0"/>
           <w:sz w:val="19"/>
           <w:rtl w:val="1"/>
+          <w:szCs w:val="19"/>
+          <w:bCs w:val="0"/>
+          <w:lang w:val="he-IL" w:bidi="he-IL"/>
         </w:rPr>
         <w:t xml:space="preserve">דְּעַל יְדֵי זֶה מְאִירִים לְלִבּוֹת בְּנֵי יִשְׂרָאֵל. </w:t>
       </w:r>
       <w:r>
         <w:rPr>
           <w:rFonts w:ascii="Times New Roman" w:hAnsi="Times New Roman" w:eastAsia="Times New Roman" w:cs="Times New Roman"/>
-          <w:b/>
+          <w:b w:val="1"/>
           <w:sz w:val="19"/>
           <w:rtl w:val="0"/>
+          <w:szCs w:val="19"/>
+          <w:bCs w:val="1"/>
+          <w:lang w:val="en-US"/>
         </w:rPr>
         <w:t xml:space="preserve">that through it they radiate into the hearts of the children of Israel. </w:t>
       </w:r>
@@ -4212,15 +5190,21 @@
           <w:b w:val="0"/>
           <w:sz w:val="19"/>
           <w:rtl w:val="1"/>
+          <w:szCs w:val="19"/>
+          <w:bCs w:val="0"/>
+          <w:lang w:val="he-IL" w:bidi="he-IL"/>
         </w:rPr>
         <w:t xml:space="preserve">וּמֹשֶׁה רַבֵּינוּ עָלָיו הַשָּׁלוֹם הוּא שׁוֹרֶשׁ הָאוֹר תּוֹרָה, </w:t>
       </w:r>
       <w:r>
         <w:rPr>
           <w:rFonts w:ascii="Times New Roman" w:hAnsi="Times New Roman" w:eastAsia="Times New Roman" w:cs="Times New Roman"/>
-          <w:b/>
+          <w:b w:val="1"/>
           <w:sz w:val="19"/>
           <w:rtl w:val="0"/>
+          <w:szCs w:val="19"/>
+          <w:bCs w:val="1"/>
+          <w:lang w:val="en-US"/>
         </w:rPr>
         <w:t xml:space="preserve">And Moses our teacher, peace be upon him, is the root of the light of Torah, </w:t>
       </w:r>
@@ -4233,15 +5217,21 @@
           <w:b w:val="0"/>
           <w:sz w:val="19"/>
           <w:rtl w:val="1"/>
+          <w:szCs w:val="19"/>
+          <w:bCs w:val="0"/>
+          <w:lang w:val="he-IL" w:bidi="he-IL"/>
         </w:rPr>
         <w:t xml:space="preserve">וּכְמוֹ שֶׁנֶּאֱמַר: "וַתֵּרֶא אֹתוֹ כִּי טוֹב", </w:t>
       </w:r>
       <w:r>
         <w:rPr>
           <w:rFonts w:ascii="Times New Roman" w:hAnsi="Times New Roman" w:eastAsia="Times New Roman" w:cs="Times New Roman"/>
-          <w:b/>
+          <w:b w:val="1"/>
           <w:sz w:val="19"/>
           <w:rtl w:val="0"/>
+          <w:szCs w:val="19"/>
+          <w:bCs w:val="1"/>
+          <w:lang w:val="en-US"/>
         </w:rPr>
         <w:t xml:space="preserve">as it is said: 'And she saw him that he was good,' </w:t>
       </w:r>
@@ -4254,15 +5244,21 @@
           <w:b w:val="0"/>
           <w:sz w:val="19"/>
           <w:rtl w:val="1"/>
+          <w:szCs w:val="19"/>
+          <w:bCs w:val="0"/>
+          <w:lang w:val="he-IL" w:bidi="he-IL"/>
         </w:rPr>
         <w:t xml:space="preserve">שֶׁכְּשֶׁנּוֹלַד נִתְמַלֵּא הַבַּיִת אוֹרָה (סוֹטָה יב.); </w:t>
       </w:r>
       <w:r>
         <w:rPr>
           <w:rFonts w:ascii="Times New Roman" w:hAnsi="Times New Roman" w:eastAsia="Times New Roman" w:cs="Times New Roman"/>
-          <w:b/>
+          <w:b w:val="1"/>
           <w:sz w:val="19"/>
           <w:rtl w:val="0"/>
+          <w:szCs w:val="19"/>
+          <w:bCs w:val="1"/>
+          <w:lang w:val="en-US"/>
         </w:rPr>
         <w:t xml:space="preserve">for when he was born the entire house was filled with light (Sotah 12a); </w:t>
       </w:r>
@@ -4290,15 +5286,21 @@
           <w:b w:val="0"/>
           <w:sz w:val="19"/>
           <w:rtl w:val="1"/>
+          <w:szCs w:val="19"/>
+          <w:bCs w:val="0"/>
+          <w:lang w:val="he-IL" w:bidi="he-IL"/>
         </w:rPr>
         <w:t xml:space="preserve">וְשֶׁיִּהְיֶה נִקְבָּע בַּלֵּב הוּא עַל יְדֵי אַהֲרֹן, </w:t>
       </w:r>
       <w:r>
         <w:rPr>
           <w:rFonts w:ascii="Times New Roman" w:hAnsi="Times New Roman" w:eastAsia="Times New Roman" w:cs="Times New Roman"/>
-          <w:b/>
+          <w:b w:val="1"/>
           <w:sz w:val="19"/>
           <w:rtl w:val="0"/>
+          <w:szCs w:val="19"/>
+          <w:bCs w:val="1"/>
+          <w:lang w:val="en-US"/>
         </w:rPr>
         <w:t xml:space="preserve">and that it become permanently ingrained in the heart is via Aaron, </w:t>
       </w:r>
@@ -4311,17 +5313,23 @@
           <w:b w:val="0"/>
           <w:sz w:val="19"/>
           <w:rtl w:val="1"/>
+          <w:szCs w:val="19"/>
+          <w:bCs w:val="0"/>
+          <w:lang w:val="he-IL" w:bidi="he-IL"/>
         </w:rPr>
         <w:t xml:space="preserve">שׁוּשְׁבִינָא דְּמַטְרוֹנִיתָא, </w:t>
       </w:r>
       <w:r>
         <w:rPr>
           <w:rFonts w:ascii="Times New Roman" w:hAnsi="Times New Roman" w:eastAsia="Times New Roman" w:cs="Times New Roman"/>
-          <w:b/>
+          <w:b w:val="1"/>
           <w:sz w:val="19"/>
           <w:rtl w:val="0"/>
-        </w:rPr>
-        <w:t xml:space="preserve">the best man of the Queen (Shekhinah), </w:t>
+          <w:szCs w:val="19"/>
+          <w:bCs w:val="1"/>
+          <w:lang w:val="en-US"/>
+        </w:rPr>
+        <w:t xml:space="preserve">the attendant of the Matronita (Shekhinah), </w:t>
       </w:r>
       <w:r>
         <w:t xml:space="preserve">  </w:t>
@@ -4332,15 +5340,21 @@
           <w:b w:val="0"/>
           <w:sz w:val="19"/>
           <w:rtl w:val="1"/>
+          <w:szCs w:val="19"/>
+          <w:bCs w:val="0"/>
+          <w:lang w:val="he-IL" w:bidi="he-IL"/>
         </w:rPr>
         <w:t xml:space="preserve">שֶׁמְּקָרְבָן לַתּוֹרָה, </w:t>
       </w:r>
       <w:r>
         <w:rPr>
           <w:rFonts w:ascii="Times New Roman" w:hAnsi="Times New Roman" w:eastAsia="Times New Roman" w:cs="Times New Roman"/>
-          <w:b/>
+          <w:b w:val="1"/>
           <w:sz w:val="19"/>
           <w:rtl w:val="0"/>
+          <w:szCs w:val="19"/>
+          <w:bCs w:val="1"/>
+          <w:lang w:val="en-US"/>
         </w:rPr>
         <w:t xml:space="preserve">who draws souls near to the Torah; </w:t>
       </w:r>
@@ -4353,15 +5367,21 @@
           <w:b w:val="0"/>
           <w:sz w:val="19"/>
           <w:rtl w:val="1"/>
+          <w:szCs w:val="19"/>
+          <w:bCs w:val="0"/>
+          <w:lang w:val="he-IL" w:bidi="he-IL"/>
         </w:rPr>
         <w:t xml:space="preserve">וְזֶהוּ "תּוֹרַת אֱמֶת שֶׁבְּפִיהוּ", </w:t>
       </w:r>
       <w:r>
         <w:rPr>
           <w:rFonts w:ascii="Times New Roman" w:hAnsi="Times New Roman" w:eastAsia="Times New Roman" w:cs="Times New Roman"/>
-          <w:b/>
+          <w:b w:val="1"/>
           <w:sz w:val="19"/>
           <w:rtl w:val="0"/>
+          <w:szCs w:val="19"/>
+          <w:bCs w:val="1"/>
+          <w:lang w:val="en-US"/>
         </w:rPr>
         <w:t xml:space="preserve">and this is 'the Torah of truth that was in his mouth,' </w:t>
       </w:r>
@@ -4374,17 +5394,23 @@
           <w:b w:val="0"/>
           <w:sz w:val="19"/>
           <w:rtl w:val="1"/>
+          <w:szCs w:val="19"/>
+          <w:bCs w:val="0"/>
+          <w:lang w:val="he-IL" w:bidi="he-IL"/>
         </w:rPr>
         <w:t xml:space="preserve">וּשְׂפַת אֱמֶת הוּא שֶׁתִּכּוֹן לָעַד: </w:t>
       </w:r>
       <w:r>
         <w:rPr>
           <w:rFonts w:ascii="Times New Roman" w:hAnsi="Times New Roman" w:eastAsia="Times New Roman" w:cs="Times New Roman"/>
-          <w:b/>
+          <w:b w:val="1"/>
           <w:sz w:val="19"/>
           <w:rtl w:val="0"/>
-        </w:rPr>
-        <w:t xml:space="preserve">and the lip of truth is that which endures forever. </w:t>
+          <w:szCs w:val="19"/>
+          <w:bCs w:val="1"/>
+          <w:lang w:val="en-US"/>
+        </w:rPr>
+        <w:t xml:space="preserve">and a truthful lip is one that endures forever. </w:t>
       </w:r>
       <w:r>
         <w:t xml:space="preserve">  </w:t>
@@ -4400,15 +5426,21 @@
           <w:b w:val="0"/>
           <w:sz w:val="19"/>
           <w:rtl w:val="1"/>
+          <w:szCs w:val="19"/>
+          <w:bCs w:val="0"/>
+          <w:lang w:val="he-IL" w:bidi="he-IL"/>
         </w:rPr>
         <w:t xml:space="preserve">עַד כָּאן מִכְּתַב יַד קָדְשׁוֹ. </w:t>
       </w:r>
       <w:r>
         <w:rPr>
           <w:rFonts w:ascii="Times New Roman" w:hAnsi="Times New Roman" w:eastAsia="Times New Roman" w:cs="Times New Roman"/>
-          <w:b/>
+          <w:b w:val="1"/>
           <w:sz w:val="19"/>
           <w:rtl w:val="0"/>
+          <w:szCs w:val="19"/>
+          <w:bCs w:val="1"/>
+          <w:lang w:val="en-US"/>
         </w:rPr>
         <w:t xml:space="preserve">Until here from his holy handwriting. </w:t>
       </w:r>

</xml_diff>